<commit_message>
nmv 18 07 2026
</commit_message>
<xml_diff>
--- a/TS Jatai Ghanam Project/TS 2.6/TS 2.6 Ghanam Malayalam Corrections.docx
+++ b/TS Jatai Ghanam Project/TS 2.6/TS 2.6 Ghanam Malayalam Corrections.docx
@@ -1,7 +1,2870 @@
 
 <file path=word/document.xml><?xml version="1.0" encoding="utf-8"?>
-<w:document xmlns:wpc="http://schemas.microsoft.com/office/word/2010/wordprocessingCanvas" xmlns:cx="http://schemas.microsoft.com/office/drawing/2014/chartex" xmlns:cx1="http://schemas.microsoft.com/office/drawing/2015/9/8/chartex" xmlns:cx2="http://schemas.microsoft.com/office/drawing/2015/10/21/chartex" xmlns:cx3="http://schemas.microsoft.com/office/drawing/2016/5/9/chartex" xmlns:cx4="http://schemas.microsoft.com/office/drawing/2016/5/10/chartex" xmlns:cx5="http://schemas.microsoft.com/office/drawing/2016/5/11/chartex" xmlns:cx6="http://schemas.microsoft.com/office/drawing/2016/5/12/chartex" xmlns:cx7="http://schemas.microsoft.com/office/drawing/2016/5/13/chartex" xmlns:cx8="http://schemas.microsoft.com/office/drawing/2016/5/14/chartex" xmlns:mc="http://schemas.openxmlformats.org/markup-compatibility/2006" xmlns:aink="http://schemas.microsoft.com/office/drawing/2016/ink" xmlns:am3d="http://schemas.microsoft.com/office/drawing/2017/model3d" xmlns:o="urn:schemas-microsoft-com:office:office" xmlns:oel="http://schemas.microsoft.com/office/2019/extlst" xmlns:r="http://schemas.openxmlformats.org/officeDocument/2006/relationships" xmlns:m="http://schemas.openxmlformats.org/officeDocument/2006/math" xmlns:v="urn:schemas-microsoft-com:vml" xmlns:wp14="http://schemas.microsoft.com/office/word/2010/wordprocessingDrawing" xmlns:wp="http://schemas.openxmlformats.org/drawingml/2006/wordprocessingDrawing" xmlns:w10="urn:schemas-microsoft-com:office:word" xmlns:w="http://schemas.openxmlformats.org/wordprocessingml/2006/main" xmlns:w14="http://schemas.microsoft.com/office/word/2010/wordml" xmlns:w15="http://schemas.microsoft.com/office/word/2012/wordml" xmlns:w16cex="http://schemas.microsoft.com/office/word/2018/wordml/cex" xmlns:w16cid="http://schemas.microsoft.com/office/word/2016/wordml/cid" xmlns:w16="http://schemas.microsoft.com/office/word/2018/wordml" xmlns:w16sdtdh="http://schemas.microsoft.com/office/word/2020/wordml/sdtdatahash" xmlns:w16se="http://schemas.microsoft.com/office/word/2015/wordml/symex" xmlns:wpg="http://schemas.microsoft.com/office/word/2010/wordprocessingGroup" xmlns:wpi="http://schemas.microsoft.com/office/word/2010/wordprocessingInk" xmlns:wne="http://schemas.microsoft.com/office/word/2006/wordml" xmlns:wps="http://schemas.microsoft.com/office/word/2010/wordprocessingShape" mc:Ignorable="w14 w15 w16se w16cid w16 w16cex w16sdtdh wp14">
+<w:document xmlns:wpc="http://schemas.microsoft.com/office/word/2010/wordprocessingCanvas" xmlns:cx="http://schemas.microsoft.com/office/drawing/2014/chartex" xmlns:cx1="http://schemas.microsoft.com/office/drawing/2015/9/8/chartex" xmlns:cx2="http://schemas.microsoft.com/office/drawing/2015/10/21/chartex" xmlns:cx3="http://schemas.microsoft.com/office/drawing/2016/5/9/chartex" xmlns:cx4="http://schemas.microsoft.com/office/drawing/2016/5/10/chartex" xmlns:cx5="http://schemas.microsoft.com/office/drawing/2016/5/11/chartex" xmlns:cx6="http://schemas.microsoft.com/office/drawing/2016/5/12/chartex" xmlns:cx7="http://schemas.microsoft.com/office/drawing/2016/5/13/chartex" xmlns:cx8="http://schemas.microsoft.com/office/drawing/2016/5/14/chartex" xmlns:mc="http://schemas.openxmlformats.org/markup-compatibility/2006" xmlns:aink="http://schemas.microsoft.com/office/drawing/2016/ink" xmlns:am3d="http://schemas.microsoft.com/office/drawing/2017/model3d" xmlns:o="urn:schemas-microsoft-com:office:office" xmlns:oel="http://schemas.microsoft.com/office/2019/extlst" xmlns:r="http://schemas.openxmlformats.org/officeDocument/2006/relationships" xmlns:m="http://schemas.openxmlformats.org/officeDocument/2006/math" xmlns:v="urn:schemas-microsoft-com:vml" xmlns:wp14="http://schemas.microsoft.com/office/word/2010/wordprocessingDrawing" xmlns:wp="http://schemas.openxmlformats.org/drawingml/2006/wordprocessingDrawing" xmlns:w10="urn:schemas-microsoft-com:office:word" xmlns:w="http://schemas.openxmlformats.org/wordprocessingml/2006/main" xmlns:w14="http://schemas.microsoft.com/office/word/2010/wordml" xmlns:w15="http://schemas.microsoft.com/office/word/2012/wordml" xmlns:w16cex="http://schemas.microsoft.com/office/word/2018/wordml/cex" xmlns:w16cid="http://schemas.microsoft.com/office/word/2016/wordml/cid" xmlns:w16="http://schemas.microsoft.com/office/word/2018/wordml" xmlns:w16du="http://schemas.microsoft.com/office/word/2023/wordml/word16du" xmlns:w16sdtdh="http://schemas.microsoft.com/office/word/2020/wordml/sdtdatahash" xmlns:w16sdtfl="http://schemas.microsoft.com/office/word/2024/wordml/sdtformatlock" xmlns:w16se="http://schemas.microsoft.com/office/word/2015/wordml/symex" xmlns:wpg="http://schemas.microsoft.com/office/word/2010/wordprocessingGroup" xmlns:wpi="http://schemas.microsoft.com/office/word/2010/wordprocessingInk" xmlns:wne="http://schemas.microsoft.com/office/word/2006/wordml" xmlns:wps="http://schemas.microsoft.com/office/word/2010/wordprocessingShape" mc:Ignorable="w14 w15 w16se w16cid w16 w16cex w16sdtdh w16sdtfl w16du wp14">
   <w:body>
+    <w:p>
+      <w:pPr>
+        <w:spacing w:before="0" w:line="240" w:lineRule="auto"/>
+        <w:jc w:val="center"/>
+        <w:rPr>
+          <w:b/>
+          <w:bCs/>
+          <w:sz w:val="32"/>
+          <w:szCs w:val="32"/>
+          <w:u w:val="single"/>
+        </w:rPr>
+      </w:pPr>
+      <w:r>
+        <w:rPr>
+          <w:b/>
+          <w:bCs/>
+          <w:sz w:val="32"/>
+          <w:szCs w:val="32"/>
+          <w:u w:val="single"/>
+        </w:rPr>
+        <w:t xml:space="preserve">TS </w:t>
+      </w:r>
+      <w:r>
+        <w:rPr>
+          <w:b/>
+          <w:bCs/>
+          <w:sz w:val="32"/>
+          <w:szCs w:val="32"/>
+          <w:u w:val="single"/>
+        </w:rPr>
+        <w:t>Ghanam</w:t>
+      </w:r>
+      <w:r>
+        <w:rPr>
+          <w:b/>
+          <w:bCs/>
+          <w:sz w:val="32"/>
+          <w:szCs w:val="32"/>
+          <w:u w:val="single"/>
+        </w:rPr>
+        <w:t xml:space="preserve"> </w:t>
+      </w:r>
+      <w:r>
+        <w:rPr>
+          <w:b/>
+          <w:bCs/>
+          <w:sz w:val="32"/>
+          <w:szCs w:val="32"/>
+          <w:u w:val="single"/>
+        </w:rPr>
+        <w:t xml:space="preserve">– TS </w:t>
+      </w:r>
+      <w:r>
+        <w:rPr>
+          <w:b/>
+          <w:bCs/>
+          <w:sz w:val="32"/>
+          <w:szCs w:val="32"/>
+          <w:u w:val="single"/>
+        </w:rPr>
+        <w:t>2.6</w:t>
+      </w:r>
+      <w:r>
+        <w:rPr>
+          <w:b/>
+          <w:bCs/>
+          <w:sz w:val="32"/>
+          <w:szCs w:val="32"/>
+          <w:u w:val="single"/>
+        </w:rPr>
+        <w:t xml:space="preserve"> </w:t>
+      </w:r>
+      <w:r>
+        <w:rPr>
+          <w:b/>
+          <w:bCs/>
+          <w:sz w:val="32"/>
+          <w:szCs w:val="32"/>
+          <w:u w:val="single"/>
+        </w:rPr>
+        <w:t>Malayalam</w:t>
+      </w:r>
+      <w:r>
+        <w:rPr>
+          <w:b/>
+          <w:bCs/>
+          <w:sz w:val="32"/>
+          <w:szCs w:val="32"/>
+          <w:u w:val="single"/>
+        </w:rPr>
+        <w:t xml:space="preserve"> Corrections –</w:t>
+      </w:r>
+      <w:r>
+        <w:rPr>
+          <w:b/>
+          <w:bCs/>
+          <w:sz w:val="32"/>
+          <w:szCs w:val="32"/>
+          <w:u w:val="single"/>
+        </w:rPr>
+        <w:t xml:space="preserve"> </w:t>
+      </w:r>
+      <w:r>
+        <w:rPr>
+          <w:b/>
+          <w:bCs/>
+          <w:sz w:val="32"/>
+          <w:szCs w:val="32"/>
+          <w:u w:val="single"/>
+        </w:rPr>
+        <w:t xml:space="preserve">Observed </w:t>
+      </w:r>
+      <w:proofErr w:type="gramStart"/>
+      <w:r>
+        <w:rPr>
+          <w:b/>
+          <w:bCs/>
+          <w:sz w:val="32"/>
+          <w:szCs w:val="32"/>
+          <w:u w:val="single"/>
+        </w:rPr>
+        <w:t xml:space="preserve">till </w:t>
+      </w:r>
+      <w:r>
+        <w:rPr>
+          <w:b/>
+          <w:bCs/>
+          <w:sz w:val="32"/>
+          <w:szCs w:val="32"/>
+          <w:highlight w:val="red"/>
+          <w:u w:val="single"/>
+        </w:rPr>
+        <w:t>?????</w:t>
+      </w:r>
+      <w:proofErr w:type="gramEnd"/>
+    </w:p>
+    <w:p>
+      <w:pPr>
+        <w:spacing w:before="0" w:line="240" w:lineRule="auto"/>
+        <w:jc w:val="center"/>
+        <w:rPr>
+          <w:b/>
+          <w:bCs/>
+          <w:sz w:val="28"/>
+          <w:szCs w:val="32"/>
+        </w:rPr>
+      </w:pPr>
+      <w:r>
+        <w:rPr>
+          <w:b/>
+          <w:bCs/>
+          <w:sz w:val="28"/>
+          <w:szCs w:val="32"/>
+        </w:rPr>
+        <w:t>(ignore those which are already incorporated in your book’s version and date)</w:t>
+      </w:r>
+    </w:p>
+    <w:tbl>
+      <w:tblPr>
+        <w:tblW w:w="14537" w:type="dxa"/>
+        <w:tblInd w:w="-792" w:type="dxa"/>
+        <w:tblBorders>
+          <w:top w:val="single" w:sz="4" w:space="0" w:color="000000"/>
+          <w:left w:val="single" w:sz="4" w:space="0" w:color="000000"/>
+          <w:bottom w:val="single" w:sz="4" w:space="0" w:color="000000"/>
+          <w:right w:val="single" w:sz="4" w:space="0" w:color="000000"/>
+          <w:insideH w:val="single" w:sz="4" w:space="0" w:color="000000"/>
+          <w:insideV w:val="single" w:sz="4" w:space="0" w:color="000000"/>
+        </w:tblBorders>
+        <w:tblLook w:val="04A0" w:firstRow="1" w:lastRow="0" w:firstColumn="1" w:lastColumn="0" w:noHBand="0" w:noVBand="1"/>
+      </w:tblPr>
+      <w:tblGrid>
+        <w:gridCol w:w="7166"/>
+        <w:gridCol w:w="7371"/>
+      </w:tblGrid>
+      <w:tr>
+        <w:tc>
+          <w:tcPr>
+            <w:tcW w:w="7166" w:type="dxa"/>
+          </w:tcPr>
+          <w:p>
+            <w:pPr>
+              <w:spacing w:before="0" w:line="240" w:lineRule="auto"/>
+              <w:jc w:val="center"/>
+              <w:rPr>
+                <w:b/>
+                <w:sz w:val="32"/>
+                <w:szCs w:val="32"/>
+              </w:rPr>
+            </w:pPr>
+            <w:r>
+              <w:rPr>
+                <w:b/>
+                <w:sz w:val="32"/>
+                <w:szCs w:val="32"/>
+              </w:rPr>
+              <w:t>As Printed</w:t>
+            </w:r>
+          </w:p>
+        </w:tc>
+        <w:tc>
+          <w:tcPr>
+            <w:tcW w:w="7371" w:type="dxa"/>
+          </w:tcPr>
+          <w:p>
+            <w:pPr>
+              <w:spacing w:before="0" w:line="240" w:lineRule="auto"/>
+              <w:ind w:right="-18"/>
+              <w:jc w:val="center"/>
+              <w:rPr>
+                <w:b/>
+                <w:sz w:val="32"/>
+                <w:szCs w:val="32"/>
+              </w:rPr>
+            </w:pPr>
+            <w:r>
+              <w:rPr>
+                <w:b/>
+                <w:sz w:val="32"/>
+                <w:szCs w:val="32"/>
+              </w:rPr>
+              <w:t>To be read as or corrected as</w:t>
+            </w:r>
+            <w:r>
+              <w:rPr>
+                <w:b/>
+                <w:sz w:val="32"/>
+                <w:szCs w:val="32"/>
+              </w:rPr>
+              <w:t xml:space="preserve"> </w:t>
+            </w:r>
+          </w:p>
+        </w:tc>
+      </w:tr>
+      <w:tr>
+        <w:trPr>
+          <w:trHeight w:val="2317"/>
+        </w:trPr>
+        <w:tc>
+          <w:tcPr>
+            <w:tcW w:w="7166" w:type="dxa"/>
+          </w:tcPr>
+          <w:p>
+            <w:pPr>
+              <w:widowControl w:val="0"/>
+              <w:autoSpaceDE w:val="0"/>
+              <w:autoSpaceDN w:val="0"/>
+              <w:adjustRightInd w:val="0"/>
+              <w:spacing w:before="0" w:line="240" w:lineRule="auto"/>
+              <w:rPr>
+                <w:rFonts w:ascii="BRH Malayalam Extra" w:hAnsi="BRH Malayalam Extra" w:cs="BRH Malayalam Extra"/>
+                <w:color w:val="000000"/>
+                <w:sz w:val="32"/>
+                <w:szCs w:val="40"/>
+              </w:rPr>
+            </w:pPr>
+            <w:r>
+              <w:rPr>
+                <w:rFonts w:cs="BRH Malayalam Extra"/>
+                <w:color w:val="000000"/>
+                <w:szCs w:val="40"/>
+              </w:rPr>
+              <w:t>49</w:t>
+            </w:r>
+            <w:r>
+              <w:rPr>
+                <w:rFonts w:ascii="BRH Malayalam Extra" w:hAnsi="BRH Malayalam Extra" w:cs="BRH Malayalam Extra"/>
+                <w:color w:val="000000"/>
+                <w:sz w:val="32"/>
+                <w:szCs w:val="40"/>
+              </w:rPr>
+              <w:t>)</w:t>
+            </w:r>
+            <w:r>
+              <w:rPr>
+                <w:rFonts w:ascii="BRH Malayalam Extra" w:hAnsi="BRH Malayalam Extra" w:cs="BRH Malayalam Extra"/>
+                <w:color w:val="000000"/>
+                <w:sz w:val="32"/>
+                <w:szCs w:val="40"/>
+              </w:rPr>
+              <w:tab/>
+            </w:r>
+            <w:r>
+              <w:rPr>
+                <w:rFonts w:cs="BRH Malayalam Extra"/>
+                <w:color w:val="000000"/>
+                <w:szCs w:val="40"/>
+              </w:rPr>
+              <w:t>2</w:t>
+            </w:r>
+            <w:r>
+              <w:rPr>
+                <w:rFonts w:ascii="BRH Malayalam Extra" w:hAnsi="BRH Malayalam Extra" w:cs="BRH Malayalam Extra"/>
+                <w:color w:val="000000"/>
+                <w:sz w:val="32"/>
+                <w:szCs w:val="40"/>
+              </w:rPr>
+              <w:t>.</w:t>
+            </w:r>
+            <w:r>
+              <w:rPr>
+                <w:rFonts w:cs="BRH Malayalam Extra"/>
+                <w:color w:val="000000"/>
+                <w:szCs w:val="40"/>
+              </w:rPr>
+              <w:t>6</w:t>
+            </w:r>
+            <w:r>
+              <w:rPr>
+                <w:rFonts w:ascii="BRH Malayalam Extra" w:hAnsi="BRH Malayalam Extra" w:cs="BRH Malayalam Extra"/>
+                <w:color w:val="000000"/>
+                <w:sz w:val="32"/>
+                <w:szCs w:val="40"/>
+              </w:rPr>
+              <w:t>.</w:t>
+            </w:r>
+            <w:r>
+              <w:rPr>
+                <w:rFonts w:cs="BRH Malayalam Extra"/>
+                <w:color w:val="000000"/>
+                <w:szCs w:val="40"/>
+              </w:rPr>
+              <w:t>5</w:t>
+            </w:r>
+            <w:r>
+              <w:rPr>
+                <w:rFonts w:ascii="BRH Malayalam Extra" w:hAnsi="BRH Malayalam Extra" w:cs="BRH Malayalam Extra"/>
+                <w:color w:val="000000"/>
+                <w:sz w:val="32"/>
+                <w:szCs w:val="40"/>
+              </w:rPr>
+              <w:t>.</w:t>
+            </w:r>
+            <w:r>
+              <w:rPr>
+                <w:rFonts w:cs="BRH Malayalam Extra"/>
+                <w:color w:val="000000"/>
+                <w:szCs w:val="40"/>
+              </w:rPr>
+              <w:t>6</w:t>
+            </w:r>
+            <w:r>
+              <w:rPr>
+                <w:rFonts w:ascii="BRH Malayalam Extra" w:hAnsi="BRH Malayalam Extra" w:cs="BRH Malayalam Extra"/>
+                <w:color w:val="000000"/>
+                <w:sz w:val="32"/>
+                <w:szCs w:val="40"/>
+              </w:rPr>
+              <w:t>(</w:t>
+            </w:r>
+            <w:r>
+              <w:rPr>
+                <w:rFonts w:cs="BRH Malayalam Extra"/>
+                <w:color w:val="000000"/>
+                <w:szCs w:val="40"/>
+              </w:rPr>
+              <w:t>45</w:t>
+            </w:r>
+            <w:r>
+              <w:rPr>
+                <w:rFonts w:ascii="BRH Malayalam Extra" w:hAnsi="BRH Malayalam Extra" w:cs="BRH Malayalam Extra"/>
+                <w:color w:val="000000"/>
+                <w:sz w:val="32"/>
+                <w:szCs w:val="40"/>
+              </w:rPr>
+              <w:t>)</w:t>
+            </w:r>
+            <w:proofErr w:type="gramStart"/>
+            <w:r>
+              <w:rPr>
+                <w:rFonts w:ascii="BRH Malayalam Extra" w:hAnsi="BRH Malayalam Extra" w:cs="BRH Malayalam Extra"/>
+                <w:color w:val="000000"/>
+                <w:sz w:val="32"/>
+                <w:szCs w:val="40"/>
+              </w:rPr>
+              <w:t>-  B</w:t>
+            </w:r>
+            <w:proofErr w:type="gramEnd"/>
+            <w:r>
+              <w:rPr>
+                <w:rFonts w:ascii="BRH Malayalam Extra" w:hAnsi="BRH Malayalam Extra" w:cs="BRH Malayalam Extra"/>
+                <w:color w:val="000000"/>
+                <w:sz w:val="26"/>
+                <w:szCs w:val="40"/>
+              </w:rPr>
+              <w:t>–</w:t>
+            </w:r>
+            <w:r>
+              <w:rPr>
+                <w:rFonts w:ascii="BRH Malayalam Extra" w:hAnsi="BRH Malayalam Extra" w:cs="BRH Malayalam Extra"/>
+                <w:color w:val="000000"/>
+                <w:sz w:val="32"/>
+                <w:szCs w:val="40"/>
+              </w:rPr>
+              <w:t>t</w:t>
+            </w:r>
+            <w:r>
+              <w:rPr>
+                <w:rFonts w:ascii="BRH Malayalam Extra" w:hAnsi="BRH Malayalam Extra" w:cs="BRH Malayalam Extra"/>
+                <w:color w:val="000000"/>
+                <w:sz w:val="26"/>
+                <w:szCs w:val="40"/>
+              </w:rPr>
+              <w:t>–</w:t>
+            </w:r>
+            <w:r>
+              <w:rPr>
+                <w:rFonts w:ascii="BRH Malayalam Extra" w:hAnsi="BRH Malayalam Extra" w:cs="BRH Malayalam Extra"/>
+                <w:color w:val="000000"/>
+                <w:sz w:val="32"/>
+                <w:szCs w:val="40"/>
+              </w:rPr>
+              <w:t xml:space="preserve"> | jZ§ | ög¢</w:t>
+            </w:r>
+            <w:r>
+              <w:rPr>
+                <w:rFonts w:ascii="BRH Malayalam Extra" w:hAnsi="BRH Malayalam Extra" w:cs="BRH Malayalam Extra"/>
+                <w:color w:val="000000"/>
+                <w:sz w:val="26"/>
+                <w:szCs w:val="40"/>
+              </w:rPr>
+              <w:t>–</w:t>
+            </w:r>
+            <w:r>
+              <w:rPr>
+                <w:rFonts w:ascii="BRH Malayalam Extra" w:hAnsi="BRH Malayalam Extra" w:cs="BRH Malayalam Extra"/>
+                <w:color w:val="000000"/>
+                <w:sz w:val="32"/>
+                <w:szCs w:val="40"/>
+                <w:highlight w:val="yellow"/>
+              </w:rPr>
+              <w:t>jx</w:t>
+            </w:r>
+            <w:r>
+              <w:rPr>
+                <w:rFonts w:ascii="BRH Malayalam Extra" w:hAnsi="BRH Malayalam Extra" w:cs="BRH Malayalam Extra"/>
+                <w:color w:val="000000"/>
+                <w:sz w:val="26"/>
+                <w:szCs w:val="40"/>
+              </w:rPr>
+              <w:t>–</w:t>
+            </w:r>
+            <w:r>
+              <w:rPr>
+                <w:rFonts w:ascii="BRH Malayalam Extra" w:hAnsi="BRH Malayalam Extra" w:cs="BRH Malayalam Extra"/>
+                <w:color w:val="000000"/>
+                <w:sz w:val="32"/>
+                <w:szCs w:val="40"/>
+              </w:rPr>
+              <w:t xml:space="preserve">Z§ | </w:t>
+            </w:r>
+          </w:p>
+          <w:p>
+            <w:pPr>
+              <w:widowControl w:val="0"/>
+              <w:autoSpaceDE w:val="0"/>
+              <w:autoSpaceDN w:val="0"/>
+              <w:adjustRightInd w:val="0"/>
+              <w:spacing w:before="0" w:line="240" w:lineRule="auto"/>
+              <w:rPr>
+                <w:rFonts w:ascii="BRH Malayalam Extra" w:hAnsi="BRH Malayalam Extra" w:cs="BRH Malayalam Extra"/>
+                <w:color w:val="000000"/>
+                <w:sz w:val="32"/>
+                <w:szCs w:val="40"/>
+              </w:rPr>
+            </w:pPr>
+            <w:r>
+              <w:rPr>
+                <w:rFonts w:ascii="BRH Malayalam Extra" w:hAnsi="BRH Malayalam Extra" w:cs="BRH Malayalam Extra"/>
+                <w:color w:val="000000"/>
+                <w:sz w:val="32"/>
+                <w:szCs w:val="40"/>
+              </w:rPr>
+              <w:t>B</w:t>
+            </w:r>
+            <w:r>
+              <w:rPr>
+                <w:rFonts w:ascii="BRH Malayalam Extra" w:hAnsi="BRH Malayalam Extra" w:cs="BRH Malayalam Extra"/>
+                <w:color w:val="000000"/>
+                <w:sz w:val="26"/>
+                <w:szCs w:val="40"/>
+              </w:rPr>
+              <w:t>–</w:t>
+            </w:r>
+            <w:r>
+              <w:rPr>
+                <w:rFonts w:ascii="BRH Malayalam Extra" w:hAnsi="BRH Malayalam Extra" w:cs="BRH Malayalam Extra"/>
+                <w:color w:val="000000"/>
+                <w:sz w:val="32"/>
+                <w:szCs w:val="40"/>
+              </w:rPr>
+              <w:t>t</w:t>
+            </w:r>
+            <w:r>
+              <w:rPr>
+                <w:rFonts w:ascii="BRH Malayalam Extra" w:hAnsi="BRH Malayalam Extra" w:cs="BRH Malayalam Extra"/>
+                <w:color w:val="000000"/>
+                <w:sz w:val="26"/>
+                <w:szCs w:val="40"/>
+              </w:rPr>
+              <w:t>–</w:t>
+            </w:r>
+            <w:r>
+              <w:rPr>
+                <w:rFonts w:ascii="BRH Malayalam Extra" w:hAnsi="BRH Malayalam Extra" w:cs="BRH Malayalam Extra"/>
+                <w:color w:val="000000"/>
+                <w:sz w:val="32"/>
+                <w:szCs w:val="40"/>
+              </w:rPr>
+              <w:t xml:space="preserve"> jb§ jbx—txt</w:t>
+            </w:r>
+            <w:r>
+              <w:rPr>
+                <w:rFonts w:ascii="BRH Malayalam Extra" w:hAnsi="BRH Malayalam Extra" w:cs="BRH Malayalam Extra"/>
+                <w:color w:val="000000"/>
+                <w:sz w:val="26"/>
+                <w:szCs w:val="40"/>
+              </w:rPr>
+              <w:t>–</w:t>
+            </w:r>
+            <w:r>
+              <w:rPr>
+                <w:rFonts w:ascii="BRH Malayalam Extra" w:hAnsi="BRH Malayalam Extra" w:cs="BRH Malayalam Extra"/>
+                <w:color w:val="000000"/>
+                <w:sz w:val="32"/>
+                <w:szCs w:val="40"/>
+              </w:rPr>
+              <w:t xml:space="preserve"> jb§ </w:t>
+            </w:r>
+            <w:r>
+              <w:rPr>
+                <w:rFonts w:ascii="BRH Malayalam Extra" w:hAnsi="BRH Malayalam Extra" w:cs="BRH Malayalam Extra"/>
+                <w:color w:val="000000"/>
+                <w:sz w:val="32"/>
+                <w:szCs w:val="40"/>
+                <w:highlight w:val="yellow"/>
+              </w:rPr>
+              <w:t>ög¢</w:t>
+            </w:r>
+            <w:r>
+              <w:rPr>
+                <w:rFonts w:ascii="BRH Malayalam Extra" w:hAnsi="BRH Malayalam Extra" w:cs="BRH Malayalam Extra"/>
+                <w:color w:val="000000"/>
+                <w:sz w:val="32"/>
+                <w:szCs w:val="40"/>
+              </w:rPr>
+              <w:t xml:space="preserve">—jxb§ </w:t>
+            </w:r>
+            <w:r>
+              <w:rPr>
+                <w:rFonts w:ascii="BRH Malayalam Extra" w:hAnsi="BRH Malayalam Extra" w:cs="BRH Malayalam Extra"/>
+                <w:color w:val="000000"/>
+                <w:sz w:val="32"/>
+                <w:szCs w:val="40"/>
+                <w:highlight w:val="yellow"/>
+              </w:rPr>
+              <w:t>ög¢jx</w:t>
+            </w:r>
+            <w:r>
+              <w:rPr>
+                <w:rFonts w:ascii="BRH Malayalam Extra" w:hAnsi="BRH Malayalam Extra" w:cs="BRH Malayalam Extra"/>
+                <w:color w:val="000000"/>
+                <w:sz w:val="26"/>
+                <w:szCs w:val="40"/>
+              </w:rPr>
+              <w:t>–</w:t>
+            </w:r>
+            <w:r>
+              <w:rPr>
+                <w:rFonts w:ascii="BRH Malayalam Extra" w:hAnsi="BRH Malayalam Extra" w:cs="BRH Malayalam Extra"/>
+                <w:color w:val="000000"/>
+                <w:sz w:val="32"/>
+                <w:szCs w:val="40"/>
+              </w:rPr>
+              <w:t xml:space="preserve">b§ </w:t>
+            </w:r>
+          </w:p>
+          <w:p>
+            <w:pPr>
+              <w:widowControl w:val="0"/>
+              <w:autoSpaceDE w:val="0"/>
+              <w:autoSpaceDN w:val="0"/>
+              <w:adjustRightInd w:val="0"/>
+              <w:spacing w:before="0" w:line="240" w:lineRule="auto"/>
+              <w:rPr>
+                <w:rFonts w:ascii="BRH Malayalam Extra" w:hAnsi="BRH Malayalam Extra" w:cs="BRH Malayalam Extra"/>
+                <w:color w:val="000000"/>
+                <w:sz w:val="32"/>
+                <w:szCs w:val="40"/>
+              </w:rPr>
+            </w:pPr>
+            <w:r>
+              <w:rPr>
+                <w:rFonts w:ascii="BRH Malayalam Extra" w:hAnsi="BRH Malayalam Extra" w:cs="BRH Malayalam Extra"/>
+                <w:color w:val="000000"/>
+                <w:sz w:val="32"/>
+                <w:szCs w:val="40"/>
+              </w:rPr>
+              <w:t>jbx—txt</w:t>
+            </w:r>
+            <w:r>
+              <w:rPr>
+                <w:rFonts w:ascii="BRH Malayalam Extra" w:hAnsi="BRH Malayalam Extra" w:cs="BRH Malayalam Extra"/>
+                <w:color w:val="000000"/>
+                <w:sz w:val="26"/>
+                <w:szCs w:val="40"/>
+              </w:rPr>
+              <w:t>–</w:t>
+            </w:r>
+            <w:r>
+              <w:rPr>
+                <w:rFonts w:ascii="BRH Malayalam Extra" w:hAnsi="BRH Malayalam Extra" w:cs="BRH Malayalam Extra"/>
+                <w:color w:val="000000"/>
+                <w:sz w:val="32"/>
+                <w:szCs w:val="40"/>
+              </w:rPr>
+              <w:t xml:space="preserve"> jb§ </w:t>
+            </w:r>
+            <w:r>
+              <w:rPr>
+                <w:rFonts w:ascii="BRH Malayalam Extra" w:hAnsi="BRH Malayalam Extra" w:cs="BRH Malayalam Extra"/>
+                <w:color w:val="000000"/>
+                <w:sz w:val="32"/>
+                <w:szCs w:val="40"/>
+                <w:highlight w:val="yellow"/>
+              </w:rPr>
+              <w:t>ög¢—</w:t>
+            </w:r>
+            <w:r>
+              <w:rPr>
+                <w:rFonts w:ascii="BRH Malayalam Extra" w:hAnsi="BRH Malayalam Extra" w:cs="BRH Malayalam Extra"/>
+                <w:color w:val="000000"/>
+                <w:sz w:val="32"/>
+                <w:szCs w:val="40"/>
+              </w:rPr>
+              <w:t xml:space="preserve">jxZ§ | </w:t>
+            </w:r>
+          </w:p>
+          <w:p>
+            <w:pPr>
+              <w:widowControl w:val="0"/>
+              <w:autoSpaceDE w:val="0"/>
+              <w:autoSpaceDN w:val="0"/>
+              <w:adjustRightInd w:val="0"/>
+              <w:spacing w:before="0" w:line="240" w:lineRule="auto"/>
+              <w:rPr>
+                <w:rFonts w:ascii="BRH Malayalam Extra" w:hAnsi="BRH Malayalam Extra" w:cs="BRH Malayalam Extra"/>
+                <w:color w:val="000000"/>
+                <w:sz w:val="32"/>
+                <w:szCs w:val="40"/>
+              </w:rPr>
+            </w:pPr>
+            <w:r>
+              <w:rPr>
+                <w:rFonts w:cs="BRH Malayalam Extra"/>
+                <w:color w:val="000000"/>
+                <w:szCs w:val="40"/>
+              </w:rPr>
+              <w:t>50</w:t>
+            </w:r>
+            <w:r>
+              <w:rPr>
+                <w:rFonts w:ascii="BRH Malayalam Extra" w:hAnsi="BRH Malayalam Extra" w:cs="BRH Malayalam Extra"/>
+                <w:color w:val="000000"/>
+                <w:sz w:val="32"/>
+                <w:szCs w:val="40"/>
+              </w:rPr>
+              <w:t>)</w:t>
+            </w:r>
+            <w:r>
+              <w:rPr>
+                <w:rFonts w:ascii="BRH Malayalam Extra" w:hAnsi="BRH Malayalam Extra" w:cs="BRH Malayalam Extra"/>
+                <w:color w:val="000000"/>
+                <w:sz w:val="32"/>
+                <w:szCs w:val="40"/>
+              </w:rPr>
+              <w:tab/>
+            </w:r>
+            <w:r>
+              <w:rPr>
+                <w:rFonts w:cs="BRH Malayalam Extra"/>
+                <w:color w:val="000000"/>
+                <w:szCs w:val="40"/>
+              </w:rPr>
+              <w:t>2</w:t>
+            </w:r>
+            <w:r>
+              <w:rPr>
+                <w:rFonts w:ascii="BRH Malayalam Extra" w:hAnsi="BRH Malayalam Extra" w:cs="BRH Malayalam Extra"/>
+                <w:color w:val="000000"/>
+                <w:sz w:val="32"/>
+                <w:szCs w:val="40"/>
+              </w:rPr>
+              <w:t>.</w:t>
+            </w:r>
+            <w:r>
+              <w:rPr>
+                <w:rFonts w:cs="BRH Malayalam Extra"/>
+                <w:color w:val="000000"/>
+                <w:szCs w:val="40"/>
+              </w:rPr>
+              <w:t>6</w:t>
+            </w:r>
+            <w:r>
+              <w:rPr>
+                <w:rFonts w:ascii="BRH Malayalam Extra" w:hAnsi="BRH Malayalam Extra" w:cs="BRH Malayalam Extra"/>
+                <w:color w:val="000000"/>
+                <w:sz w:val="32"/>
+                <w:szCs w:val="40"/>
+              </w:rPr>
+              <w:t>.</w:t>
+            </w:r>
+            <w:r>
+              <w:rPr>
+                <w:rFonts w:cs="BRH Malayalam Extra"/>
+                <w:color w:val="000000"/>
+                <w:szCs w:val="40"/>
+              </w:rPr>
+              <w:t>5</w:t>
+            </w:r>
+            <w:r>
+              <w:rPr>
+                <w:rFonts w:ascii="BRH Malayalam Extra" w:hAnsi="BRH Malayalam Extra" w:cs="BRH Malayalam Extra"/>
+                <w:color w:val="000000"/>
+                <w:sz w:val="32"/>
+                <w:szCs w:val="40"/>
+              </w:rPr>
+              <w:t>.</w:t>
+            </w:r>
+            <w:r>
+              <w:rPr>
+                <w:rFonts w:cs="BRH Malayalam Extra"/>
+                <w:color w:val="000000"/>
+                <w:szCs w:val="40"/>
+              </w:rPr>
+              <w:t>6</w:t>
+            </w:r>
+            <w:r>
+              <w:rPr>
+                <w:rFonts w:ascii="BRH Malayalam Extra" w:hAnsi="BRH Malayalam Extra" w:cs="BRH Malayalam Extra"/>
+                <w:color w:val="000000"/>
+                <w:sz w:val="32"/>
+                <w:szCs w:val="40"/>
+              </w:rPr>
+              <w:t>(</w:t>
+            </w:r>
+            <w:r>
+              <w:rPr>
+                <w:rFonts w:cs="BRH Malayalam Extra"/>
+                <w:color w:val="000000"/>
+                <w:szCs w:val="40"/>
+              </w:rPr>
+              <w:t>46</w:t>
+            </w:r>
+            <w:r>
+              <w:rPr>
+                <w:rFonts w:ascii="BRH Malayalam Extra" w:hAnsi="BRH Malayalam Extra" w:cs="BRH Malayalam Extra"/>
+                <w:color w:val="000000"/>
+                <w:sz w:val="32"/>
+                <w:szCs w:val="40"/>
+              </w:rPr>
+              <w:t>)</w:t>
+            </w:r>
+            <w:proofErr w:type="gramStart"/>
+            <w:r>
+              <w:rPr>
+                <w:rFonts w:ascii="BRH Malayalam Extra" w:hAnsi="BRH Malayalam Extra" w:cs="BRH Malayalam Extra"/>
+                <w:color w:val="000000"/>
+                <w:sz w:val="32"/>
+                <w:szCs w:val="40"/>
+              </w:rPr>
+              <w:t>-  jZ</w:t>
+            </w:r>
+            <w:proofErr w:type="gramEnd"/>
+            <w:r>
+              <w:rPr>
+                <w:rFonts w:ascii="BRH Malayalam Extra" w:hAnsi="BRH Malayalam Extra" w:cs="BRH Malayalam Extra"/>
+                <w:color w:val="000000"/>
+                <w:sz w:val="32"/>
+                <w:szCs w:val="40"/>
+              </w:rPr>
+              <w:t>§ | ög¢</w:t>
+            </w:r>
+            <w:r>
+              <w:rPr>
+                <w:rFonts w:ascii="BRH Malayalam Extra" w:hAnsi="BRH Malayalam Extra" w:cs="BRH Malayalam Extra"/>
+                <w:color w:val="000000"/>
+                <w:sz w:val="26"/>
+                <w:szCs w:val="40"/>
+              </w:rPr>
+              <w:t>–</w:t>
+            </w:r>
+            <w:r>
+              <w:rPr>
+                <w:rFonts w:ascii="BRH Malayalam Extra" w:hAnsi="BRH Malayalam Extra" w:cs="BRH Malayalam Extra"/>
+                <w:color w:val="000000"/>
+                <w:sz w:val="32"/>
+                <w:szCs w:val="40"/>
+                <w:highlight w:val="yellow"/>
+              </w:rPr>
+              <w:t>jx</w:t>
+            </w:r>
+            <w:r>
+              <w:rPr>
+                <w:rFonts w:ascii="BRH Malayalam Extra" w:hAnsi="BRH Malayalam Extra" w:cs="BRH Malayalam Extra"/>
+                <w:color w:val="000000"/>
+                <w:sz w:val="26"/>
+                <w:szCs w:val="40"/>
+              </w:rPr>
+              <w:t>–</w:t>
+            </w:r>
+            <w:r>
+              <w:rPr>
+                <w:rFonts w:ascii="BRH Malayalam Extra" w:hAnsi="BRH Malayalam Extra" w:cs="BRH Malayalam Extra"/>
+                <w:color w:val="000000"/>
+                <w:sz w:val="32"/>
+                <w:szCs w:val="40"/>
+              </w:rPr>
+              <w:t>Z§ | AMË§— |</w:t>
+            </w:r>
+          </w:p>
+          <w:p>
+            <w:pPr>
+              <w:widowControl w:val="0"/>
+              <w:autoSpaceDE w:val="0"/>
+              <w:autoSpaceDN w:val="0"/>
+              <w:adjustRightInd w:val="0"/>
+              <w:spacing w:before="0" w:line="240" w:lineRule="auto"/>
+              <w:rPr>
+                <w:rFonts w:ascii="BRH Malayalam Extra" w:hAnsi="BRH Malayalam Extra" w:cs="BRH Malayalam Extra"/>
+                <w:color w:val="000000"/>
+                <w:sz w:val="32"/>
+                <w:szCs w:val="40"/>
+              </w:rPr>
+            </w:pPr>
+            <w:r>
+              <w:rPr>
+                <w:rFonts w:ascii="BRH Malayalam Extra" w:hAnsi="BRH Malayalam Extra" w:cs="BRH Malayalam Extra"/>
+                <w:color w:val="000000"/>
+                <w:sz w:val="32"/>
+                <w:szCs w:val="40"/>
+              </w:rPr>
+              <w:t xml:space="preserve">jb§ </w:t>
+            </w:r>
+            <w:r>
+              <w:rPr>
+                <w:rFonts w:ascii="BRH Malayalam Extra" w:hAnsi="BRH Malayalam Extra" w:cs="BRH Malayalam Extra"/>
+                <w:color w:val="000000"/>
+                <w:sz w:val="32"/>
+                <w:szCs w:val="40"/>
+                <w:highlight w:val="yellow"/>
+              </w:rPr>
+              <w:t>ög¢</w:t>
+            </w:r>
+            <w:r>
+              <w:rPr>
+                <w:rFonts w:ascii="BRH Malayalam Extra" w:hAnsi="BRH Malayalam Extra" w:cs="BRH Malayalam Extra"/>
+                <w:color w:val="000000"/>
+                <w:sz w:val="32"/>
+                <w:szCs w:val="40"/>
+              </w:rPr>
+              <w:t xml:space="preserve">—jxb§ </w:t>
+            </w:r>
+            <w:r>
+              <w:rPr>
+                <w:rFonts w:ascii="BRH Malayalam Extra" w:hAnsi="BRH Malayalam Extra" w:cs="BRH Malayalam Extra"/>
+                <w:color w:val="000000"/>
+                <w:sz w:val="32"/>
+                <w:szCs w:val="40"/>
+                <w:highlight w:val="yellow"/>
+              </w:rPr>
+              <w:t>ög¢jx</w:t>
+            </w:r>
+            <w:r>
+              <w:rPr>
+                <w:rFonts w:ascii="BRH Malayalam Extra" w:hAnsi="BRH Malayalam Extra" w:cs="BRH Malayalam Extra"/>
+                <w:color w:val="000000"/>
+                <w:sz w:val="26"/>
+                <w:szCs w:val="40"/>
+              </w:rPr>
+              <w:t>–</w:t>
+            </w:r>
+            <w:r>
+              <w:rPr>
+                <w:rFonts w:ascii="BRH Malayalam Extra" w:hAnsi="BRH Malayalam Extra" w:cs="BRH Malayalam Extra"/>
+                <w:color w:val="000000"/>
+                <w:sz w:val="32"/>
+                <w:szCs w:val="40"/>
+              </w:rPr>
+              <w:t xml:space="preserve">b§ jb§ jb§ </w:t>
+            </w:r>
+            <w:r>
+              <w:rPr>
+                <w:rFonts w:ascii="BRH Malayalam Extra" w:hAnsi="BRH Malayalam Extra" w:cs="BRH Malayalam Extra"/>
+                <w:color w:val="000000"/>
+                <w:sz w:val="32"/>
+                <w:szCs w:val="40"/>
+                <w:highlight w:val="yellow"/>
+              </w:rPr>
+              <w:t>ög¢—jx</w:t>
+            </w:r>
+            <w:r>
+              <w:rPr>
+                <w:rFonts w:ascii="BRH Malayalam Extra" w:hAnsi="BRH Malayalam Extra" w:cs="BRH Malayalam Extra"/>
+                <w:color w:val="000000"/>
+                <w:sz w:val="26"/>
+                <w:szCs w:val="40"/>
+              </w:rPr>
+              <w:t>–</w:t>
+            </w:r>
+            <w:r>
+              <w:rPr>
+                <w:rFonts w:ascii="BRH Malayalam Extra" w:hAnsi="BRH Malayalam Extra" w:cs="BRH Malayalam Extra"/>
+                <w:color w:val="000000"/>
+                <w:sz w:val="32"/>
+                <w:szCs w:val="40"/>
+              </w:rPr>
+              <w:t xml:space="preserve"> bM</w:t>
+            </w:r>
+            <w:r>
+              <w:rPr>
+                <w:rFonts w:ascii="BRH Malayalam Extra" w:hAnsi="BRH Malayalam Extra" w:cs="BRH Malayalam Extra"/>
+                <w:color w:val="000000"/>
+                <w:sz w:val="26"/>
+                <w:szCs w:val="40"/>
+              </w:rPr>
+              <w:t>–</w:t>
+            </w:r>
+            <w:r>
+              <w:rPr>
+                <w:rFonts w:ascii="BRH Malayalam Extra" w:hAnsi="BRH Malayalam Extra" w:cs="BRH Malayalam Extra"/>
+                <w:color w:val="000000"/>
+                <w:sz w:val="32"/>
+                <w:szCs w:val="40"/>
+              </w:rPr>
+              <w:t xml:space="preserve">© dM—© </w:t>
+            </w:r>
+            <w:r>
+              <w:rPr>
+                <w:rFonts w:ascii="BRH Malayalam Extra" w:hAnsi="BRH Malayalam Extra" w:cs="BRH Malayalam Extra"/>
+                <w:color w:val="000000"/>
+                <w:sz w:val="32"/>
+                <w:szCs w:val="40"/>
+                <w:highlight w:val="yellow"/>
+              </w:rPr>
+              <w:t>ög¢jx</w:t>
+            </w:r>
+            <w:r>
+              <w:rPr>
+                <w:rFonts w:ascii="BRH Malayalam Extra" w:hAnsi="BRH Malayalam Extra" w:cs="BRH Malayalam Extra"/>
+                <w:color w:val="000000"/>
+                <w:sz w:val="26"/>
+                <w:szCs w:val="40"/>
+              </w:rPr>
+              <w:t>–</w:t>
+            </w:r>
+            <w:r>
+              <w:rPr>
+                <w:rFonts w:ascii="BRH Malayalam Extra" w:hAnsi="BRH Malayalam Extra" w:cs="BRH Malayalam Extra"/>
+                <w:color w:val="000000"/>
+                <w:sz w:val="32"/>
+                <w:szCs w:val="40"/>
+              </w:rPr>
+              <w:t xml:space="preserve">b§ jb§ jb§ </w:t>
+            </w:r>
+            <w:r>
+              <w:rPr>
+                <w:rFonts w:ascii="BRH Malayalam Extra" w:hAnsi="BRH Malayalam Extra" w:cs="BRH Malayalam Extra"/>
+                <w:color w:val="000000"/>
+                <w:sz w:val="32"/>
+                <w:szCs w:val="40"/>
+                <w:highlight w:val="yellow"/>
+              </w:rPr>
+              <w:t>ög¢—jx</w:t>
+            </w:r>
+            <w:r>
+              <w:rPr>
+                <w:rFonts w:ascii="BRH Malayalam Extra" w:hAnsi="BRH Malayalam Extra" w:cs="BRH Malayalam Extra"/>
+                <w:color w:val="000000"/>
+                <w:sz w:val="26"/>
+                <w:szCs w:val="40"/>
+                <w:highlight w:val="yellow"/>
+              </w:rPr>
+              <w:t>–</w:t>
+            </w:r>
+            <w:r>
+              <w:rPr>
+                <w:rFonts w:ascii="BRH Malayalam Extra" w:hAnsi="BRH Malayalam Extra" w:cs="BRH Malayalam Extra"/>
+                <w:color w:val="000000"/>
+                <w:sz w:val="32"/>
+                <w:szCs w:val="40"/>
+              </w:rPr>
+              <w:t xml:space="preserve"> bMË§— | </w:t>
+            </w:r>
+          </w:p>
+          <w:p>
+            <w:pPr>
+              <w:widowControl w:val="0"/>
+              <w:autoSpaceDE w:val="0"/>
+              <w:autoSpaceDN w:val="0"/>
+              <w:adjustRightInd w:val="0"/>
+              <w:spacing w:before="0" w:line="240" w:lineRule="auto"/>
+              <w:rPr>
+                <w:rFonts w:ascii="BRH Malayalam Extra" w:hAnsi="BRH Malayalam Extra" w:cs="BRH Malayalam Extra"/>
+                <w:color w:val="000000"/>
+                <w:sz w:val="32"/>
+                <w:szCs w:val="40"/>
+              </w:rPr>
+            </w:pPr>
+            <w:r>
+              <w:rPr>
+                <w:rFonts w:cs="BRH Malayalam Extra"/>
+                <w:color w:val="000000"/>
+                <w:szCs w:val="40"/>
+              </w:rPr>
+              <w:t>51</w:t>
+            </w:r>
+            <w:r>
+              <w:rPr>
+                <w:rFonts w:ascii="BRH Malayalam Extra" w:hAnsi="BRH Malayalam Extra" w:cs="BRH Malayalam Extra"/>
+                <w:color w:val="000000"/>
+                <w:sz w:val="32"/>
+                <w:szCs w:val="40"/>
+              </w:rPr>
+              <w:t>)</w:t>
+            </w:r>
+            <w:r>
+              <w:rPr>
+                <w:rFonts w:ascii="BRH Malayalam Extra" w:hAnsi="BRH Malayalam Extra" w:cs="BRH Malayalam Extra"/>
+                <w:color w:val="000000"/>
+                <w:sz w:val="32"/>
+                <w:szCs w:val="40"/>
+              </w:rPr>
+              <w:tab/>
+            </w:r>
+            <w:r>
+              <w:rPr>
+                <w:rFonts w:cs="BRH Malayalam Extra"/>
+                <w:color w:val="000000"/>
+                <w:szCs w:val="40"/>
+              </w:rPr>
+              <w:t>2</w:t>
+            </w:r>
+            <w:r>
+              <w:rPr>
+                <w:rFonts w:ascii="BRH Malayalam Extra" w:hAnsi="BRH Malayalam Extra" w:cs="BRH Malayalam Extra"/>
+                <w:color w:val="000000"/>
+                <w:sz w:val="32"/>
+                <w:szCs w:val="40"/>
+              </w:rPr>
+              <w:t>.</w:t>
+            </w:r>
+            <w:r>
+              <w:rPr>
+                <w:rFonts w:cs="BRH Malayalam Extra"/>
+                <w:color w:val="000000"/>
+                <w:szCs w:val="40"/>
+              </w:rPr>
+              <w:t>6</w:t>
+            </w:r>
+            <w:r>
+              <w:rPr>
+                <w:rFonts w:ascii="BRH Malayalam Extra" w:hAnsi="BRH Malayalam Extra" w:cs="BRH Malayalam Extra"/>
+                <w:color w:val="000000"/>
+                <w:sz w:val="32"/>
+                <w:szCs w:val="40"/>
+              </w:rPr>
+              <w:t>.</w:t>
+            </w:r>
+            <w:r>
+              <w:rPr>
+                <w:rFonts w:cs="BRH Malayalam Extra"/>
+                <w:color w:val="000000"/>
+                <w:szCs w:val="40"/>
+              </w:rPr>
+              <w:t>5</w:t>
+            </w:r>
+            <w:r>
+              <w:rPr>
+                <w:rFonts w:ascii="BRH Malayalam Extra" w:hAnsi="BRH Malayalam Extra" w:cs="BRH Malayalam Extra"/>
+                <w:color w:val="000000"/>
+                <w:sz w:val="32"/>
+                <w:szCs w:val="40"/>
+              </w:rPr>
+              <w:t>.</w:t>
+            </w:r>
+            <w:r>
+              <w:rPr>
+                <w:rFonts w:cs="BRH Malayalam Extra"/>
+                <w:color w:val="000000"/>
+                <w:szCs w:val="40"/>
+              </w:rPr>
+              <w:t>6</w:t>
+            </w:r>
+            <w:r>
+              <w:rPr>
+                <w:rFonts w:ascii="BRH Malayalam Extra" w:hAnsi="BRH Malayalam Extra" w:cs="BRH Malayalam Extra"/>
+                <w:color w:val="000000"/>
+                <w:sz w:val="32"/>
+                <w:szCs w:val="40"/>
+              </w:rPr>
+              <w:t>(</w:t>
+            </w:r>
+            <w:r>
+              <w:rPr>
+                <w:rFonts w:cs="BRH Malayalam Extra"/>
+                <w:color w:val="000000"/>
+                <w:szCs w:val="40"/>
+              </w:rPr>
+              <w:t>47</w:t>
+            </w:r>
+            <w:r>
+              <w:rPr>
+                <w:rFonts w:ascii="BRH Malayalam Extra" w:hAnsi="BRH Malayalam Extra" w:cs="BRH Malayalam Extra"/>
+                <w:color w:val="000000"/>
+                <w:sz w:val="32"/>
+                <w:szCs w:val="40"/>
+              </w:rPr>
+              <w:t>)</w:t>
+            </w:r>
+            <w:proofErr w:type="gramStart"/>
+            <w:r>
+              <w:rPr>
+                <w:rFonts w:ascii="BRH Malayalam Extra" w:hAnsi="BRH Malayalam Extra" w:cs="BRH Malayalam Extra"/>
+                <w:color w:val="000000"/>
+                <w:sz w:val="32"/>
+                <w:szCs w:val="40"/>
+              </w:rPr>
+              <w:t>-  ög</w:t>
+            </w:r>
+            <w:proofErr w:type="gramEnd"/>
+            <w:r>
+              <w:rPr>
+                <w:rFonts w:ascii="BRH Malayalam Extra" w:hAnsi="BRH Malayalam Extra" w:cs="BRH Malayalam Extra"/>
+                <w:color w:val="000000"/>
+                <w:sz w:val="32"/>
+                <w:szCs w:val="40"/>
+              </w:rPr>
+              <w:t>¢</w:t>
+            </w:r>
+            <w:r>
+              <w:rPr>
+                <w:rFonts w:ascii="BRH Malayalam Extra" w:hAnsi="BRH Malayalam Extra" w:cs="BRH Malayalam Extra"/>
+                <w:color w:val="000000"/>
+                <w:sz w:val="26"/>
+                <w:szCs w:val="40"/>
+              </w:rPr>
+              <w:t>–</w:t>
+            </w:r>
+            <w:r>
+              <w:rPr>
+                <w:rFonts w:ascii="BRH Malayalam Extra" w:hAnsi="BRH Malayalam Extra" w:cs="BRH Malayalam Extra"/>
+                <w:color w:val="000000"/>
+                <w:sz w:val="32"/>
+                <w:szCs w:val="40"/>
+                <w:highlight w:val="yellow"/>
+              </w:rPr>
+              <w:t>jx</w:t>
+            </w:r>
+            <w:r>
+              <w:rPr>
+                <w:rFonts w:ascii="BRH Malayalam Extra" w:hAnsi="BRH Malayalam Extra" w:cs="BRH Malayalam Extra"/>
+                <w:color w:val="000000"/>
+                <w:sz w:val="26"/>
+                <w:szCs w:val="40"/>
+              </w:rPr>
+              <w:t>–</w:t>
+            </w:r>
+            <w:r>
+              <w:rPr>
+                <w:rFonts w:ascii="BRH Malayalam Extra" w:hAnsi="BRH Malayalam Extra" w:cs="BRH Malayalam Extra"/>
+                <w:color w:val="000000"/>
+                <w:sz w:val="32"/>
+                <w:szCs w:val="40"/>
+              </w:rPr>
+              <w:t>Z§ | AMË§— | A</w:t>
+            </w:r>
+            <w:r>
+              <w:rPr>
+                <w:rFonts w:ascii="BRH Malayalam Extra" w:hAnsi="BRH Malayalam Extra" w:cs="BRH Malayalam Extra"/>
+                <w:color w:val="000000"/>
+                <w:sz w:val="26"/>
+                <w:szCs w:val="40"/>
+              </w:rPr>
+              <w:t>–</w:t>
+            </w:r>
+            <w:r>
+              <w:rPr>
+                <w:rFonts w:ascii="BRH Malayalam Extra" w:hAnsi="BRH Malayalam Extra" w:cs="BRH Malayalam Extra"/>
+                <w:color w:val="000000"/>
+                <w:sz w:val="32"/>
+                <w:szCs w:val="40"/>
+              </w:rPr>
+              <w:t>²yJ |</w:t>
+            </w:r>
+          </w:p>
+          <w:p>
+            <w:pPr>
+              <w:widowControl w:val="0"/>
+              <w:autoSpaceDE w:val="0"/>
+              <w:autoSpaceDN w:val="0"/>
+              <w:adjustRightInd w:val="0"/>
+              <w:spacing w:before="0" w:line="240" w:lineRule="auto"/>
+              <w:rPr>
+                <w:rFonts w:ascii="BRH Malayalam Extra" w:hAnsi="BRH Malayalam Extra" w:cs="BRH Malayalam Extra"/>
+                <w:color w:val="000000"/>
+                <w:sz w:val="32"/>
+                <w:szCs w:val="40"/>
+              </w:rPr>
+            </w:pPr>
+            <w:r>
+              <w:rPr>
+                <w:rFonts w:ascii="BRH Malayalam Extra" w:hAnsi="BRH Malayalam Extra" w:cs="BRH Malayalam Extra"/>
+                <w:color w:val="000000"/>
+                <w:sz w:val="32"/>
+                <w:szCs w:val="40"/>
+              </w:rPr>
+              <w:t>ög¢</w:t>
+            </w:r>
+            <w:r>
+              <w:rPr>
+                <w:rFonts w:ascii="BRH Malayalam Extra" w:hAnsi="BRH Malayalam Extra" w:cs="BRH Malayalam Extra"/>
+                <w:color w:val="000000"/>
+                <w:sz w:val="26"/>
+                <w:szCs w:val="40"/>
+              </w:rPr>
+              <w:t>–</w:t>
+            </w:r>
+            <w:r>
+              <w:rPr>
+                <w:rFonts w:ascii="BRH Malayalam Extra" w:hAnsi="BRH Malayalam Extra" w:cs="BRH Malayalam Extra"/>
+                <w:color w:val="000000"/>
+                <w:sz w:val="32"/>
+                <w:szCs w:val="40"/>
+                <w:highlight w:val="yellow"/>
+              </w:rPr>
+              <w:t>jx</w:t>
+            </w:r>
+            <w:r>
+              <w:rPr>
+                <w:rFonts w:ascii="BRH Malayalam Extra" w:hAnsi="BRH Malayalam Extra" w:cs="BRH Malayalam Extra"/>
+                <w:color w:val="000000"/>
+                <w:sz w:val="26"/>
+                <w:szCs w:val="40"/>
+                <w:highlight w:val="yellow"/>
+              </w:rPr>
+              <w:t>–</w:t>
+            </w:r>
+            <w:r>
+              <w:rPr>
+                <w:rFonts w:ascii="BRH Malayalam Extra" w:hAnsi="BRH Malayalam Extra" w:cs="BRH Malayalam Extra"/>
+                <w:color w:val="000000"/>
+                <w:sz w:val="32"/>
+                <w:szCs w:val="40"/>
+              </w:rPr>
+              <w:t xml:space="preserve"> bM</w:t>
+            </w:r>
+            <w:r>
+              <w:rPr>
+                <w:rFonts w:ascii="BRH Malayalam Extra" w:hAnsi="BRH Malayalam Extra" w:cs="BRH Malayalam Extra"/>
+                <w:color w:val="000000"/>
+                <w:sz w:val="26"/>
+                <w:szCs w:val="40"/>
+              </w:rPr>
+              <w:t>–</w:t>
+            </w:r>
+            <w:r>
+              <w:rPr>
+                <w:rFonts w:ascii="BRH Malayalam Extra" w:hAnsi="BRH Malayalam Extra" w:cs="BRH Malayalam Extra"/>
+                <w:color w:val="000000"/>
+                <w:sz w:val="32"/>
+                <w:szCs w:val="40"/>
+              </w:rPr>
+              <w:t xml:space="preserve">© dM—© </w:t>
+            </w:r>
+            <w:r>
+              <w:rPr>
+                <w:rFonts w:ascii="BRH Malayalam Extra" w:hAnsi="BRH Malayalam Extra" w:cs="BRH Malayalam Extra"/>
+                <w:color w:val="000000"/>
+                <w:sz w:val="32"/>
+                <w:szCs w:val="40"/>
+                <w:highlight w:val="yellow"/>
+              </w:rPr>
+              <w:t>ög¢</w:t>
+            </w:r>
+            <w:r>
+              <w:rPr>
+                <w:rFonts w:ascii="BRH Malayalam Extra" w:hAnsi="BRH Malayalam Extra" w:cs="BRH Malayalam Extra"/>
+                <w:color w:val="000000"/>
+                <w:sz w:val="32"/>
+                <w:szCs w:val="40"/>
+              </w:rPr>
+              <w:t xml:space="preserve">jxb§ </w:t>
+            </w:r>
+            <w:r>
+              <w:rPr>
+                <w:rFonts w:ascii="BRH Malayalam Extra" w:hAnsi="BRH Malayalam Extra" w:cs="BRH Malayalam Extra"/>
+                <w:color w:val="000000"/>
+                <w:sz w:val="32"/>
+                <w:szCs w:val="40"/>
+                <w:highlight w:val="yellow"/>
+              </w:rPr>
+              <w:t>ög¢jx</w:t>
+            </w:r>
+            <w:r>
+              <w:rPr>
+                <w:rFonts w:ascii="BRH Malayalam Extra" w:hAnsi="BRH Malayalam Extra" w:cs="BRH Malayalam Extra"/>
+                <w:color w:val="000000"/>
+                <w:sz w:val="26"/>
+                <w:szCs w:val="40"/>
+              </w:rPr>
+              <w:t>–</w:t>
+            </w:r>
+            <w:r>
+              <w:rPr>
+                <w:rFonts w:ascii="BRH Malayalam Extra" w:hAnsi="BRH Malayalam Extra" w:cs="BRH Malayalam Extra"/>
+                <w:color w:val="000000"/>
+                <w:sz w:val="32"/>
+                <w:szCs w:val="40"/>
+              </w:rPr>
+              <w:t xml:space="preserve"> bM—© d</w:t>
+            </w:r>
+            <w:r>
+              <w:rPr>
+                <w:rFonts w:ascii="BRH Malayalam Extra" w:hAnsi="BRH Malayalam Extra" w:cs="BRH Malayalam Extra"/>
+                <w:color w:val="000000"/>
+                <w:sz w:val="26"/>
+                <w:szCs w:val="40"/>
+              </w:rPr>
+              <w:t>–</w:t>
+            </w:r>
+            <w:r>
+              <w:rPr>
+                <w:rFonts w:ascii="BRH Malayalam Extra" w:hAnsi="BRH Malayalam Extra" w:cs="BRH Malayalam Extra"/>
+                <w:color w:val="000000"/>
+                <w:sz w:val="32"/>
+                <w:szCs w:val="40"/>
+              </w:rPr>
+              <w:t xml:space="preserve">²y </w:t>
+            </w:r>
+          </w:p>
+          <w:p>
+            <w:pPr>
+              <w:widowControl w:val="0"/>
+              <w:autoSpaceDE w:val="0"/>
+              <w:autoSpaceDN w:val="0"/>
+              <w:adjustRightInd w:val="0"/>
+              <w:spacing w:before="0" w:line="240" w:lineRule="auto"/>
+              <w:rPr>
+                <w:rFonts w:ascii="BRH Malayalam Extra" w:hAnsi="BRH Malayalam Extra" w:cs="BRH Malayalam Extra"/>
+                <w:color w:val="000000"/>
+                <w:sz w:val="32"/>
+                <w:szCs w:val="40"/>
+              </w:rPr>
+            </w:pPr>
+            <w:r>
+              <w:rPr>
+                <w:rFonts w:ascii="BRH Malayalam Extra" w:hAnsi="BRH Malayalam Extra" w:cs="BRH Malayalam Extra"/>
+                <w:color w:val="000000"/>
+                <w:sz w:val="32"/>
+                <w:szCs w:val="40"/>
+              </w:rPr>
+              <w:t>k</w:t>
+            </w:r>
+            <w:r>
+              <w:rPr>
+                <w:rFonts w:ascii="BRH Malayalam Extra" w:hAnsi="BRH Malayalam Extra" w:cs="BRH Malayalam Extra"/>
+                <w:color w:val="000000"/>
+                <w:sz w:val="26"/>
+                <w:szCs w:val="40"/>
+              </w:rPr>
+              <w:t>–</w:t>
+            </w:r>
+            <w:r>
+              <w:rPr>
+                <w:rFonts w:ascii="BRH Malayalam Extra" w:hAnsi="BRH Malayalam Extra" w:cs="BRH Malayalam Extra"/>
+                <w:color w:val="000000"/>
+                <w:sz w:val="32"/>
+                <w:szCs w:val="40"/>
+              </w:rPr>
+              <w:t xml:space="preserve">²y kM—© </w:t>
+            </w:r>
+            <w:r>
+              <w:rPr>
+                <w:rFonts w:ascii="BRH Malayalam Extra" w:hAnsi="BRH Malayalam Extra" w:cs="BRH Malayalam Extra"/>
+                <w:color w:val="000000"/>
+                <w:sz w:val="32"/>
+                <w:szCs w:val="40"/>
+                <w:highlight w:val="yellow"/>
+              </w:rPr>
+              <w:t>ög¢</w:t>
+            </w:r>
+            <w:r>
+              <w:rPr>
+                <w:rFonts w:ascii="BRH Malayalam Extra" w:hAnsi="BRH Malayalam Extra" w:cs="BRH Malayalam Extra"/>
+                <w:color w:val="000000"/>
+                <w:sz w:val="32"/>
+                <w:szCs w:val="40"/>
+              </w:rPr>
+              <w:t xml:space="preserve">jxb§ </w:t>
+            </w:r>
+            <w:r>
+              <w:rPr>
+                <w:rFonts w:ascii="BRH Malayalam Extra" w:hAnsi="BRH Malayalam Extra" w:cs="BRH Malayalam Extra"/>
+                <w:color w:val="000000"/>
+                <w:sz w:val="32"/>
+                <w:szCs w:val="40"/>
+                <w:highlight w:val="yellow"/>
+              </w:rPr>
+              <w:t>ög¢jx</w:t>
+            </w:r>
+            <w:r>
+              <w:rPr>
+                <w:rFonts w:ascii="BRH Malayalam Extra" w:hAnsi="BRH Malayalam Extra" w:cs="BRH Malayalam Extra"/>
+                <w:color w:val="000000"/>
+                <w:sz w:val="26"/>
+                <w:szCs w:val="40"/>
+              </w:rPr>
+              <w:t>–</w:t>
+            </w:r>
+            <w:r>
+              <w:rPr>
+                <w:rFonts w:ascii="BRH Malayalam Extra" w:hAnsi="BRH Malayalam Extra" w:cs="BRH Malayalam Extra"/>
+                <w:color w:val="000000"/>
+                <w:sz w:val="32"/>
+                <w:szCs w:val="40"/>
+              </w:rPr>
+              <w:t xml:space="preserve"> bM—© d</w:t>
+            </w:r>
+            <w:r>
+              <w:rPr>
+                <w:rFonts w:ascii="BRH Malayalam Extra" w:hAnsi="BRH Malayalam Extra" w:cs="BRH Malayalam Extra"/>
+                <w:color w:val="000000"/>
+                <w:sz w:val="26"/>
+                <w:szCs w:val="40"/>
+              </w:rPr>
+              <w:t>–</w:t>
+            </w:r>
+            <w:r>
+              <w:rPr>
+                <w:rFonts w:ascii="BRH Malayalam Extra" w:hAnsi="BRH Malayalam Extra" w:cs="BRH Malayalam Extra"/>
+                <w:color w:val="000000"/>
+                <w:sz w:val="32"/>
+                <w:szCs w:val="40"/>
+              </w:rPr>
+              <w:t xml:space="preserve">²yJ | </w:t>
+            </w:r>
+          </w:p>
+          <w:p>
+            <w:pPr>
+              <w:widowControl w:val="0"/>
+              <w:autoSpaceDE w:val="0"/>
+              <w:autoSpaceDN w:val="0"/>
+              <w:adjustRightInd w:val="0"/>
+              <w:spacing w:before="0" w:line="240" w:lineRule="auto"/>
+              <w:rPr>
+                <w:rFonts w:cs="BRH Malayalam Extra"/>
+                <w:szCs w:val="40"/>
+              </w:rPr>
+            </w:pPr>
+          </w:p>
+        </w:tc>
+        <w:tc>
+          <w:tcPr>
+            <w:tcW w:w="7371" w:type="dxa"/>
+          </w:tcPr>
+          <w:p>
+            <w:pPr>
+              <w:widowControl w:val="0"/>
+              <w:autoSpaceDE w:val="0"/>
+              <w:autoSpaceDN w:val="0"/>
+              <w:adjustRightInd w:val="0"/>
+              <w:spacing w:before="0" w:line="240" w:lineRule="auto"/>
+              <w:rPr>
+                <w:rFonts w:ascii="BRH Malayalam Extra" w:hAnsi="BRH Malayalam Extra" w:cs="BRH Malayalam Extra"/>
+                <w:color w:val="000000"/>
+                <w:sz w:val="32"/>
+                <w:szCs w:val="40"/>
+              </w:rPr>
+            </w:pPr>
+            <w:r>
+              <w:rPr>
+                <w:rFonts w:cs="BRH Malayalam Extra"/>
+                <w:color w:val="000000"/>
+                <w:szCs w:val="40"/>
+              </w:rPr>
+              <w:t>49</w:t>
+            </w:r>
+            <w:r>
+              <w:rPr>
+                <w:rFonts w:ascii="BRH Malayalam Extra" w:hAnsi="BRH Malayalam Extra" w:cs="BRH Malayalam Extra"/>
+                <w:color w:val="000000"/>
+                <w:sz w:val="32"/>
+                <w:szCs w:val="40"/>
+              </w:rPr>
+              <w:t>)</w:t>
+            </w:r>
+            <w:r>
+              <w:rPr>
+                <w:rFonts w:ascii="BRH Malayalam Extra" w:hAnsi="BRH Malayalam Extra" w:cs="BRH Malayalam Extra"/>
+                <w:color w:val="000000"/>
+                <w:sz w:val="32"/>
+                <w:szCs w:val="40"/>
+              </w:rPr>
+              <w:tab/>
+            </w:r>
+            <w:r>
+              <w:rPr>
+                <w:rFonts w:cs="BRH Malayalam Extra"/>
+                <w:color w:val="000000"/>
+                <w:szCs w:val="40"/>
+              </w:rPr>
+              <w:t>2</w:t>
+            </w:r>
+            <w:r>
+              <w:rPr>
+                <w:rFonts w:ascii="BRH Malayalam Extra" w:hAnsi="BRH Malayalam Extra" w:cs="BRH Malayalam Extra"/>
+                <w:color w:val="000000"/>
+                <w:sz w:val="32"/>
+                <w:szCs w:val="40"/>
+              </w:rPr>
+              <w:t>.</w:t>
+            </w:r>
+            <w:r>
+              <w:rPr>
+                <w:rFonts w:cs="BRH Malayalam Extra"/>
+                <w:color w:val="000000"/>
+                <w:szCs w:val="40"/>
+              </w:rPr>
+              <w:t>6</w:t>
+            </w:r>
+            <w:r>
+              <w:rPr>
+                <w:rFonts w:ascii="BRH Malayalam Extra" w:hAnsi="BRH Malayalam Extra" w:cs="BRH Malayalam Extra"/>
+                <w:color w:val="000000"/>
+                <w:sz w:val="32"/>
+                <w:szCs w:val="40"/>
+              </w:rPr>
+              <w:t>.</w:t>
+            </w:r>
+            <w:r>
+              <w:rPr>
+                <w:rFonts w:cs="BRH Malayalam Extra"/>
+                <w:color w:val="000000"/>
+                <w:szCs w:val="40"/>
+              </w:rPr>
+              <w:t>5</w:t>
+            </w:r>
+            <w:r>
+              <w:rPr>
+                <w:rFonts w:ascii="BRH Malayalam Extra" w:hAnsi="BRH Malayalam Extra" w:cs="BRH Malayalam Extra"/>
+                <w:color w:val="000000"/>
+                <w:sz w:val="32"/>
+                <w:szCs w:val="40"/>
+              </w:rPr>
+              <w:t>.</w:t>
+            </w:r>
+            <w:r>
+              <w:rPr>
+                <w:rFonts w:cs="BRH Malayalam Extra"/>
+                <w:color w:val="000000"/>
+                <w:szCs w:val="40"/>
+              </w:rPr>
+              <w:t>6</w:t>
+            </w:r>
+            <w:r>
+              <w:rPr>
+                <w:rFonts w:ascii="BRH Malayalam Extra" w:hAnsi="BRH Malayalam Extra" w:cs="BRH Malayalam Extra"/>
+                <w:color w:val="000000"/>
+                <w:sz w:val="32"/>
+                <w:szCs w:val="40"/>
+              </w:rPr>
+              <w:t>(</w:t>
+            </w:r>
+            <w:r>
+              <w:rPr>
+                <w:rFonts w:cs="BRH Malayalam Extra"/>
+                <w:color w:val="000000"/>
+                <w:szCs w:val="40"/>
+              </w:rPr>
+              <w:t>45</w:t>
+            </w:r>
+            <w:r>
+              <w:rPr>
+                <w:rFonts w:ascii="BRH Malayalam Extra" w:hAnsi="BRH Malayalam Extra" w:cs="BRH Malayalam Extra"/>
+                <w:color w:val="000000"/>
+                <w:sz w:val="32"/>
+                <w:szCs w:val="40"/>
+              </w:rPr>
+              <w:t>)</w:t>
+            </w:r>
+            <w:proofErr w:type="gramStart"/>
+            <w:r>
+              <w:rPr>
+                <w:rFonts w:ascii="BRH Malayalam Extra" w:hAnsi="BRH Malayalam Extra" w:cs="BRH Malayalam Extra"/>
+                <w:color w:val="000000"/>
+                <w:sz w:val="32"/>
+                <w:szCs w:val="40"/>
+              </w:rPr>
+              <w:t>-  B</w:t>
+            </w:r>
+            <w:proofErr w:type="gramEnd"/>
+            <w:r>
+              <w:rPr>
+                <w:rFonts w:ascii="BRH Malayalam Extra" w:hAnsi="BRH Malayalam Extra" w:cs="BRH Malayalam Extra"/>
+                <w:color w:val="000000"/>
+                <w:sz w:val="26"/>
+                <w:szCs w:val="40"/>
+              </w:rPr>
+              <w:t>–</w:t>
+            </w:r>
+            <w:r>
+              <w:rPr>
+                <w:rFonts w:ascii="BRH Malayalam Extra" w:hAnsi="BRH Malayalam Extra" w:cs="BRH Malayalam Extra"/>
+                <w:color w:val="000000"/>
+                <w:sz w:val="32"/>
+                <w:szCs w:val="40"/>
+              </w:rPr>
+              <w:t>t</w:t>
+            </w:r>
+            <w:r>
+              <w:rPr>
+                <w:rFonts w:ascii="BRH Malayalam Extra" w:hAnsi="BRH Malayalam Extra" w:cs="BRH Malayalam Extra"/>
+                <w:color w:val="000000"/>
+                <w:sz w:val="26"/>
+                <w:szCs w:val="40"/>
+              </w:rPr>
+              <w:t>–</w:t>
+            </w:r>
+            <w:r>
+              <w:rPr>
+                <w:rFonts w:ascii="BRH Malayalam Extra" w:hAnsi="BRH Malayalam Extra" w:cs="BRH Malayalam Extra"/>
+                <w:color w:val="000000"/>
+                <w:sz w:val="32"/>
+                <w:szCs w:val="40"/>
+              </w:rPr>
+              <w:t xml:space="preserve"> | jZ§ | ög¢</w:t>
+            </w:r>
+            <w:r>
+              <w:rPr>
+                <w:rFonts w:ascii="BRH Malayalam Extra" w:hAnsi="BRH Malayalam Extra" w:cs="BRH Malayalam Extra"/>
+                <w:color w:val="000000"/>
+                <w:sz w:val="26"/>
+                <w:szCs w:val="40"/>
+              </w:rPr>
+              <w:t>–</w:t>
+            </w:r>
+            <w:r>
+              <w:rPr>
+                <w:rFonts w:ascii="BRH Malayalam Extra" w:hAnsi="BRH Malayalam Extra" w:cs="BRH Malayalam Extra"/>
+                <w:color w:val="000000"/>
+                <w:sz w:val="32"/>
+                <w:szCs w:val="40"/>
+                <w:highlight w:val="green"/>
+              </w:rPr>
+              <w:t>jx</w:t>
+            </w:r>
+            <w:r>
+              <w:rPr>
+                <w:rFonts w:ascii="BRH Malayalam Extra" w:hAnsi="BRH Malayalam Extra" w:cs="BRH Malayalam Extra"/>
+                <w:color w:val="000000"/>
+                <w:sz w:val="32"/>
+                <w:szCs w:val="40"/>
+              </w:rPr>
+              <w:t xml:space="preserve">Z§ | </w:t>
+            </w:r>
+          </w:p>
+          <w:p>
+            <w:pPr>
+              <w:widowControl w:val="0"/>
+              <w:autoSpaceDE w:val="0"/>
+              <w:autoSpaceDN w:val="0"/>
+              <w:adjustRightInd w:val="0"/>
+              <w:spacing w:before="0" w:line="240" w:lineRule="auto"/>
+              <w:rPr>
+                <w:rFonts w:ascii="BRH Malayalam Extra" w:hAnsi="BRH Malayalam Extra" w:cs="BRH Malayalam Extra"/>
+                <w:color w:val="000000"/>
+                <w:sz w:val="32"/>
+                <w:szCs w:val="40"/>
+              </w:rPr>
+            </w:pPr>
+            <w:r>
+              <w:rPr>
+                <w:rFonts w:ascii="BRH Malayalam Extra" w:hAnsi="BRH Malayalam Extra" w:cs="BRH Malayalam Extra"/>
+                <w:color w:val="000000"/>
+                <w:sz w:val="32"/>
+                <w:szCs w:val="40"/>
+              </w:rPr>
+              <w:t>B</w:t>
+            </w:r>
+            <w:r>
+              <w:rPr>
+                <w:rFonts w:ascii="BRH Malayalam Extra" w:hAnsi="BRH Malayalam Extra" w:cs="BRH Malayalam Extra"/>
+                <w:color w:val="000000"/>
+                <w:sz w:val="26"/>
+                <w:szCs w:val="40"/>
+              </w:rPr>
+              <w:t>–</w:t>
+            </w:r>
+            <w:r>
+              <w:rPr>
+                <w:rFonts w:ascii="BRH Malayalam Extra" w:hAnsi="BRH Malayalam Extra" w:cs="BRH Malayalam Extra"/>
+                <w:color w:val="000000"/>
+                <w:sz w:val="32"/>
+                <w:szCs w:val="40"/>
+              </w:rPr>
+              <w:t>t</w:t>
+            </w:r>
+            <w:r>
+              <w:rPr>
+                <w:rFonts w:ascii="BRH Malayalam Extra" w:hAnsi="BRH Malayalam Extra" w:cs="BRH Malayalam Extra"/>
+                <w:color w:val="000000"/>
+                <w:sz w:val="26"/>
+                <w:szCs w:val="40"/>
+              </w:rPr>
+              <w:t>–</w:t>
+            </w:r>
+            <w:r>
+              <w:rPr>
+                <w:rFonts w:ascii="BRH Malayalam Extra" w:hAnsi="BRH Malayalam Extra" w:cs="BRH Malayalam Extra"/>
+                <w:color w:val="000000"/>
+                <w:sz w:val="32"/>
+                <w:szCs w:val="40"/>
+              </w:rPr>
+              <w:t xml:space="preserve"> jb§ jbx—txt</w:t>
+            </w:r>
+            <w:r>
+              <w:rPr>
+                <w:rFonts w:ascii="BRH Malayalam Extra" w:hAnsi="BRH Malayalam Extra" w:cs="BRH Malayalam Extra"/>
+                <w:color w:val="000000"/>
+                <w:sz w:val="26"/>
+                <w:szCs w:val="40"/>
+              </w:rPr>
+              <w:t>–</w:t>
+            </w:r>
+            <w:r>
+              <w:rPr>
+                <w:rFonts w:ascii="BRH Malayalam Extra" w:hAnsi="BRH Malayalam Extra" w:cs="BRH Malayalam Extra"/>
+                <w:color w:val="000000"/>
+                <w:sz w:val="32"/>
+                <w:szCs w:val="40"/>
+              </w:rPr>
+              <w:t xml:space="preserve"> jb§ </w:t>
+            </w:r>
+            <w:r>
+              <w:rPr>
+                <w:rFonts w:ascii="BRH Malayalam Extra" w:hAnsi="BRH Malayalam Extra" w:cs="BRH Malayalam Extra"/>
+                <w:color w:val="000000"/>
+                <w:sz w:val="32"/>
+                <w:szCs w:val="40"/>
+                <w:highlight w:val="green"/>
+              </w:rPr>
+              <w:t>ög¢</w:t>
+            </w:r>
+            <w:r>
+              <w:rPr>
+                <w:rFonts w:ascii="BRH Malayalam Extra" w:hAnsi="BRH Malayalam Extra" w:cs="BRH Malayalam Extra"/>
+                <w:color w:val="000000"/>
+                <w:sz w:val="26"/>
+                <w:szCs w:val="40"/>
+              </w:rPr>
+              <w:t>–</w:t>
+            </w:r>
+            <w:r>
+              <w:rPr>
+                <w:rFonts w:ascii="BRH Malayalam Extra" w:hAnsi="BRH Malayalam Extra" w:cs="BRH Malayalam Extra"/>
+                <w:color w:val="000000"/>
+                <w:sz w:val="32"/>
+                <w:szCs w:val="40"/>
+              </w:rPr>
+              <w:t xml:space="preserve">jxb§ </w:t>
+            </w:r>
+            <w:r>
+              <w:rPr>
+                <w:rFonts w:ascii="BRH Malayalam Extra" w:hAnsi="BRH Malayalam Extra" w:cs="BRH Malayalam Extra"/>
+                <w:color w:val="000000"/>
+                <w:sz w:val="32"/>
+                <w:szCs w:val="40"/>
+                <w:highlight w:val="green"/>
+              </w:rPr>
+              <w:t>ög¢</w:t>
+            </w:r>
+            <w:r>
+              <w:rPr>
+                <w:rFonts w:ascii="BRH Malayalam Extra" w:hAnsi="BRH Malayalam Extra" w:cs="BRH Malayalam Extra"/>
+                <w:color w:val="000000"/>
+                <w:sz w:val="26"/>
+                <w:szCs w:val="40"/>
+                <w:highlight w:val="green"/>
+              </w:rPr>
+              <w:t>–</w:t>
+            </w:r>
+            <w:r>
+              <w:rPr>
+                <w:rFonts w:ascii="BRH Malayalam Extra" w:hAnsi="BRH Malayalam Extra" w:cs="BRH Malayalam Extra"/>
+                <w:color w:val="000000"/>
+                <w:sz w:val="32"/>
+                <w:szCs w:val="40"/>
+                <w:highlight w:val="green"/>
+              </w:rPr>
+              <w:t>jx</w:t>
+            </w:r>
+            <w:r>
+              <w:rPr>
+                <w:rFonts w:ascii="BRH Malayalam Extra" w:hAnsi="BRH Malayalam Extra" w:cs="BRH Malayalam Extra"/>
+                <w:color w:val="000000"/>
+                <w:sz w:val="32"/>
+                <w:szCs w:val="40"/>
+              </w:rPr>
+              <w:t xml:space="preserve">b§ </w:t>
+            </w:r>
+          </w:p>
+          <w:p>
+            <w:pPr>
+              <w:widowControl w:val="0"/>
+              <w:autoSpaceDE w:val="0"/>
+              <w:autoSpaceDN w:val="0"/>
+              <w:adjustRightInd w:val="0"/>
+              <w:spacing w:before="0" w:line="240" w:lineRule="auto"/>
+              <w:rPr>
+                <w:rFonts w:ascii="BRH Malayalam Extra" w:hAnsi="BRH Malayalam Extra" w:cs="BRH Malayalam Extra"/>
+                <w:color w:val="000000"/>
+                <w:sz w:val="32"/>
+                <w:szCs w:val="40"/>
+              </w:rPr>
+            </w:pPr>
+            <w:r>
+              <w:rPr>
+                <w:rFonts w:ascii="BRH Malayalam Extra" w:hAnsi="BRH Malayalam Extra" w:cs="BRH Malayalam Extra"/>
+                <w:color w:val="000000"/>
+                <w:sz w:val="32"/>
+                <w:szCs w:val="40"/>
+              </w:rPr>
+              <w:t>jbx—txt</w:t>
+            </w:r>
+            <w:r>
+              <w:rPr>
+                <w:rFonts w:ascii="BRH Malayalam Extra" w:hAnsi="BRH Malayalam Extra" w:cs="BRH Malayalam Extra"/>
+                <w:color w:val="000000"/>
+                <w:sz w:val="26"/>
+                <w:szCs w:val="40"/>
+              </w:rPr>
+              <w:t>–</w:t>
+            </w:r>
+            <w:r>
+              <w:rPr>
+                <w:rFonts w:ascii="BRH Malayalam Extra" w:hAnsi="BRH Malayalam Extra" w:cs="BRH Malayalam Extra"/>
+                <w:color w:val="000000"/>
+                <w:sz w:val="32"/>
+                <w:szCs w:val="40"/>
+              </w:rPr>
+              <w:t xml:space="preserve"> jb§ </w:t>
+            </w:r>
+            <w:r>
+              <w:rPr>
+                <w:rFonts w:ascii="BRH Malayalam Extra" w:hAnsi="BRH Malayalam Extra" w:cs="BRH Malayalam Extra"/>
+                <w:color w:val="000000"/>
+                <w:sz w:val="32"/>
+                <w:szCs w:val="40"/>
+                <w:highlight w:val="green"/>
+              </w:rPr>
+              <w:t>ög¢</w:t>
+            </w:r>
+            <w:r>
+              <w:rPr>
+                <w:rFonts w:ascii="BRH Malayalam Extra" w:hAnsi="BRH Malayalam Extra" w:cs="BRH Malayalam Extra"/>
+                <w:color w:val="000000"/>
+                <w:sz w:val="26"/>
+                <w:szCs w:val="40"/>
+              </w:rPr>
+              <w:t>–</w:t>
+            </w:r>
+            <w:r>
+              <w:rPr>
+                <w:rFonts w:ascii="BRH Malayalam Extra" w:hAnsi="BRH Malayalam Extra" w:cs="BRH Malayalam Extra"/>
+                <w:color w:val="000000"/>
+                <w:sz w:val="32"/>
+                <w:szCs w:val="40"/>
+              </w:rPr>
+              <w:t xml:space="preserve">jxZ§ | </w:t>
+            </w:r>
+          </w:p>
+          <w:p>
+            <w:pPr>
+              <w:widowControl w:val="0"/>
+              <w:autoSpaceDE w:val="0"/>
+              <w:autoSpaceDN w:val="0"/>
+              <w:adjustRightInd w:val="0"/>
+              <w:spacing w:before="0" w:line="240" w:lineRule="auto"/>
+              <w:rPr>
+                <w:rFonts w:ascii="BRH Malayalam Extra" w:hAnsi="BRH Malayalam Extra" w:cs="BRH Malayalam Extra"/>
+                <w:color w:val="000000"/>
+                <w:sz w:val="32"/>
+                <w:szCs w:val="40"/>
+              </w:rPr>
+            </w:pPr>
+            <w:r>
+              <w:rPr>
+                <w:rFonts w:cs="BRH Malayalam Extra"/>
+                <w:color w:val="000000"/>
+                <w:szCs w:val="40"/>
+              </w:rPr>
+              <w:t>50</w:t>
+            </w:r>
+            <w:r>
+              <w:rPr>
+                <w:rFonts w:ascii="BRH Malayalam Extra" w:hAnsi="BRH Malayalam Extra" w:cs="BRH Malayalam Extra"/>
+                <w:color w:val="000000"/>
+                <w:sz w:val="32"/>
+                <w:szCs w:val="40"/>
+              </w:rPr>
+              <w:t>)</w:t>
+            </w:r>
+            <w:r>
+              <w:rPr>
+                <w:rFonts w:ascii="BRH Malayalam Extra" w:hAnsi="BRH Malayalam Extra" w:cs="BRH Malayalam Extra"/>
+                <w:color w:val="000000"/>
+                <w:sz w:val="32"/>
+                <w:szCs w:val="40"/>
+              </w:rPr>
+              <w:tab/>
+            </w:r>
+            <w:r>
+              <w:rPr>
+                <w:rFonts w:cs="BRH Malayalam Extra"/>
+                <w:color w:val="000000"/>
+                <w:szCs w:val="40"/>
+              </w:rPr>
+              <w:t>2</w:t>
+            </w:r>
+            <w:r>
+              <w:rPr>
+                <w:rFonts w:ascii="BRH Malayalam Extra" w:hAnsi="BRH Malayalam Extra" w:cs="BRH Malayalam Extra"/>
+                <w:color w:val="000000"/>
+                <w:sz w:val="32"/>
+                <w:szCs w:val="40"/>
+              </w:rPr>
+              <w:t>.</w:t>
+            </w:r>
+            <w:r>
+              <w:rPr>
+                <w:rFonts w:cs="BRH Malayalam Extra"/>
+                <w:color w:val="000000"/>
+                <w:szCs w:val="40"/>
+              </w:rPr>
+              <w:t>6</w:t>
+            </w:r>
+            <w:r>
+              <w:rPr>
+                <w:rFonts w:ascii="BRH Malayalam Extra" w:hAnsi="BRH Malayalam Extra" w:cs="BRH Malayalam Extra"/>
+                <w:color w:val="000000"/>
+                <w:sz w:val="32"/>
+                <w:szCs w:val="40"/>
+              </w:rPr>
+              <w:t>.</w:t>
+            </w:r>
+            <w:r>
+              <w:rPr>
+                <w:rFonts w:cs="BRH Malayalam Extra"/>
+                <w:color w:val="000000"/>
+                <w:szCs w:val="40"/>
+              </w:rPr>
+              <w:t>5</w:t>
+            </w:r>
+            <w:r>
+              <w:rPr>
+                <w:rFonts w:ascii="BRH Malayalam Extra" w:hAnsi="BRH Malayalam Extra" w:cs="BRH Malayalam Extra"/>
+                <w:color w:val="000000"/>
+                <w:sz w:val="32"/>
+                <w:szCs w:val="40"/>
+              </w:rPr>
+              <w:t>.</w:t>
+            </w:r>
+            <w:r>
+              <w:rPr>
+                <w:rFonts w:cs="BRH Malayalam Extra"/>
+                <w:color w:val="000000"/>
+                <w:szCs w:val="40"/>
+              </w:rPr>
+              <w:t>6</w:t>
+            </w:r>
+            <w:r>
+              <w:rPr>
+                <w:rFonts w:ascii="BRH Malayalam Extra" w:hAnsi="BRH Malayalam Extra" w:cs="BRH Malayalam Extra"/>
+                <w:color w:val="000000"/>
+                <w:sz w:val="32"/>
+                <w:szCs w:val="40"/>
+              </w:rPr>
+              <w:t>(</w:t>
+            </w:r>
+            <w:r>
+              <w:rPr>
+                <w:rFonts w:cs="BRH Malayalam Extra"/>
+                <w:color w:val="000000"/>
+                <w:szCs w:val="40"/>
+              </w:rPr>
+              <w:t>46</w:t>
+            </w:r>
+            <w:r>
+              <w:rPr>
+                <w:rFonts w:ascii="BRH Malayalam Extra" w:hAnsi="BRH Malayalam Extra" w:cs="BRH Malayalam Extra"/>
+                <w:color w:val="000000"/>
+                <w:sz w:val="32"/>
+                <w:szCs w:val="40"/>
+              </w:rPr>
+              <w:t>)</w:t>
+            </w:r>
+            <w:proofErr w:type="gramStart"/>
+            <w:r>
+              <w:rPr>
+                <w:rFonts w:ascii="BRH Malayalam Extra" w:hAnsi="BRH Malayalam Extra" w:cs="BRH Malayalam Extra"/>
+                <w:color w:val="000000"/>
+                <w:sz w:val="32"/>
+                <w:szCs w:val="40"/>
+              </w:rPr>
+              <w:t>-  jZ</w:t>
+            </w:r>
+            <w:proofErr w:type="gramEnd"/>
+            <w:r>
+              <w:rPr>
+                <w:rFonts w:ascii="BRH Malayalam Extra" w:hAnsi="BRH Malayalam Extra" w:cs="BRH Malayalam Extra"/>
+                <w:color w:val="000000"/>
+                <w:sz w:val="32"/>
+                <w:szCs w:val="40"/>
+              </w:rPr>
+              <w:t>§ | ög¢</w:t>
+            </w:r>
+            <w:r>
+              <w:rPr>
+                <w:rFonts w:ascii="BRH Malayalam Extra" w:hAnsi="BRH Malayalam Extra" w:cs="BRH Malayalam Extra"/>
+                <w:color w:val="000000"/>
+                <w:sz w:val="26"/>
+                <w:szCs w:val="40"/>
+              </w:rPr>
+              <w:t>–</w:t>
+            </w:r>
+            <w:r>
+              <w:rPr>
+                <w:rFonts w:ascii="BRH Malayalam Extra" w:hAnsi="BRH Malayalam Extra" w:cs="BRH Malayalam Extra"/>
+                <w:color w:val="000000"/>
+                <w:sz w:val="32"/>
+                <w:szCs w:val="40"/>
+                <w:highlight w:val="green"/>
+              </w:rPr>
+              <w:t>jx</w:t>
+            </w:r>
+            <w:r>
+              <w:rPr>
+                <w:rFonts w:ascii="BRH Malayalam Extra" w:hAnsi="BRH Malayalam Extra" w:cs="BRH Malayalam Extra"/>
+                <w:color w:val="000000"/>
+                <w:sz w:val="32"/>
+                <w:szCs w:val="40"/>
+              </w:rPr>
+              <w:t>Z§ | AMË§— |</w:t>
+            </w:r>
+          </w:p>
+          <w:p>
+            <w:pPr>
+              <w:widowControl w:val="0"/>
+              <w:autoSpaceDE w:val="0"/>
+              <w:autoSpaceDN w:val="0"/>
+              <w:adjustRightInd w:val="0"/>
+              <w:spacing w:before="0" w:line="240" w:lineRule="auto"/>
+              <w:rPr>
+                <w:rFonts w:ascii="BRH Malayalam Extra" w:hAnsi="BRH Malayalam Extra" w:cs="BRH Malayalam Extra"/>
+                <w:color w:val="000000"/>
+                <w:sz w:val="32"/>
+                <w:szCs w:val="40"/>
+              </w:rPr>
+            </w:pPr>
+            <w:r>
+              <w:rPr>
+                <w:rFonts w:ascii="BRH Malayalam Extra" w:hAnsi="BRH Malayalam Extra" w:cs="BRH Malayalam Extra"/>
+                <w:color w:val="000000"/>
+                <w:sz w:val="32"/>
+                <w:szCs w:val="40"/>
+              </w:rPr>
+              <w:t xml:space="preserve">jb§ </w:t>
+            </w:r>
+            <w:r>
+              <w:rPr>
+                <w:rFonts w:ascii="BRH Malayalam Extra" w:hAnsi="BRH Malayalam Extra" w:cs="BRH Malayalam Extra"/>
+                <w:color w:val="000000"/>
+                <w:sz w:val="32"/>
+                <w:szCs w:val="40"/>
+                <w:highlight w:val="green"/>
+              </w:rPr>
+              <w:t>ög¢</w:t>
+            </w:r>
+            <w:r>
+              <w:rPr>
+                <w:rFonts w:ascii="BRH Malayalam Extra" w:hAnsi="BRH Malayalam Extra" w:cs="BRH Malayalam Extra"/>
+                <w:color w:val="000000"/>
+                <w:sz w:val="26"/>
+                <w:szCs w:val="40"/>
+              </w:rPr>
+              <w:t>–</w:t>
+            </w:r>
+            <w:r>
+              <w:rPr>
+                <w:rFonts w:ascii="BRH Malayalam Extra" w:hAnsi="BRH Malayalam Extra" w:cs="BRH Malayalam Extra"/>
+                <w:color w:val="000000"/>
+                <w:sz w:val="32"/>
+                <w:szCs w:val="40"/>
+              </w:rPr>
+              <w:t xml:space="preserve">jxb§ </w:t>
+            </w:r>
+            <w:r>
+              <w:rPr>
+                <w:rFonts w:ascii="BRH Malayalam Extra" w:hAnsi="BRH Malayalam Extra" w:cs="BRH Malayalam Extra"/>
+                <w:color w:val="000000"/>
+                <w:sz w:val="32"/>
+                <w:szCs w:val="40"/>
+                <w:highlight w:val="green"/>
+              </w:rPr>
+              <w:t>ög¢</w:t>
+            </w:r>
+            <w:r>
+              <w:rPr>
+                <w:rFonts w:ascii="BRH Malayalam Extra" w:hAnsi="BRH Malayalam Extra" w:cs="BRH Malayalam Extra"/>
+                <w:color w:val="000000"/>
+                <w:sz w:val="26"/>
+                <w:szCs w:val="40"/>
+                <w:highlight w:val="green"/>
+              </w:rPr>
+              <w:t>–</w:t>
+            </w:r>
+            <w:r>
+              <w:rPr>
+                <w:rFonts w:ascii="BRH Malayalam Extra" w:hAnsi="BRH Malayalam Extra" w:cs="BRH Malayalam Extra"/>
+                <w:color w:val="000000"/>
+                <w:sz w:val="32"/>
+                <w:szCs w:val="40"/>
+                <w:highlight w:val="green"/>
+              </w:rPr>
+              <w:t>jx</w:t>
+            </w:r>
+            <w:r>
+              <w:rPr>
+                <w:rFonts w:ascii="BRH Malayalam Extra" w:hAnsi="BRH Malayalam Extra" w:cs="BRH Malayalam Extra"/>
+                <w:color w:val="000000"/>
+                <w:sz w:val="32"/>
+                <w:szCs w:val="40"/>
+              </w:rPr>
+              <w:t xml:space="preserve">b§ jb§ jb§ </w:t>
+            </w:r>
+            <w:r>
+              <w:rPr>
+                <w:rFonts w:ascii="BRH Malayalam Extra" w:hAnsi="BRH Malayalam Extra" w:cs="BRH Malayalam Extra"/>
+                <w:color w:val="000000"/>
+                <w:sz w:val="32"/>
+                <w:szCs w:val="40"/>
+                <w:highlight w:val="green"/>
+              </w:rPr>
+              <w:t>ög¢</w:t>
+            </w:r>
+            <w:r>
+              <w:rPr>
+                <w:rFonts w:ascii="BRH Malayalam Extra" w:hAnsi="BRH Malayalam Extra" w:cs="BRH Malayalam Extra"/>
+                <w:color w:val="000000"/>
+                <w:sz w:val="26"/>
+                <w:szCs w:val="40"/>
+                <w:highlight w:val="green"/>
+              </w:rPr>
+              <w:t>–</w:t>
+            </w:r>
+            <w:r>
+              <w:rPr>
+                <w:rFonts w:ascii="BRH Malayalam Extra" w:hAnsi="BRH Malayalam Extra" w:cs="BRH Malayalam Extra"/>
+                <w:color w:val="000000"/>
+                <w:sz w:val="32"/>
+                <w:szCs w:val="40"/>
+                <w:highlight w:val="green"/>
+              </w:rPr>
+              <w:t>jx</w:t>
+            </w:r>
+            <w:r>
+              <w:rPr>
+                <w:rFonts w:ascii="BRH Malayalam Extra" w:hAnsi="BRH Malayalam Extra" w:cs="BRH Malayalam Extra"/>
+                <w:color w:val="000000"/>
+                <w:sz w:val="32"/>
+                <w:szCs w:val="40"/>
+              </w:rPr>
+              <w:t xml:space="preserve"> bM</w:t>
+            </w:r>
+            <w:r>
+              <w:rPr>
+                <w:rFonts w:ascii="BRH Malayalam Extra" w:hAnsi="BRH Malayalam Extra" w:cs="BRH Malayalam Extra"/>
+                <w:color w:val="000000"/>
+                <w:sz w:val="26"/>
+                <w:szCs w:val="40"/>
+              </w:rPr>
+              <w:t>–</w:t>
+            </w:r>
+            <w:r>
+              <w:rPr>
+                <w:rFonts w:ascii="BRH Malayalam Extra" w:hAnsi="BRH Malayalam Extra" w:cs="BRH Malayalam Extra"/>
+                <w:color w:val="000000"/>
+                <w:sz w:val="32"/>
+                <w:szCs w:val="40"/>
+              </w:rPr>
+              <w:t xml:space="preserve">© dM—© </w:t>
+            </w:r>
+            <w:r>
+              <w:rPr>
+                <w:rFonts w:ascii="BRH Malayalam Extra" w:hAnsi="BRH Malayalam Extra" w:cs="BRH Malayalam Extra"/>
+                <w:color w:val="000000"/>
+                <w:sz w:val="32"/>
+                <w:szCs w:val="40"/>
+                <w:highlight w:val="green"/>
+              </w:rPr>
+              <w:t>ög¢</w:t>
+            </w:r>
+            <w:r>
+              <w:rPr>
+                <w:rFonts w:ascii="BRH Malayalam Extra" w:hAnsi="BRH Malayalam Extra" w:cs="BRH Malayalam Extra"/>
+                <w:color w:val="000000"/>
+                <w:sz w:val="26"/>
+                <w:szCs w:val="40"/>
+                <w:highlight w:val="green"/>
+              </w:rPr>
+              <w:t>–</w:t>
+            </w:r>
+            <w:r>
+              <w:rPr>
+                <w:rFonts w:ascii="BRH Malayalam Extra" w:hAnsi="BRH Malayalam Extra" w:cs="BRH Malayalam Extra"/>
+                <w:color w:val="000000"/>
+                <w:sz w:val="32"/>
+                <w:szCs w:val="40"/>
+                <w:highlight w:val="green"/>
+              </w:rPr>
+              <w:t>jx</w:t>
+            </w:r>
+            <w:r>
+              <w:rPr>
+                <w:rFonts w:ascii="BRH Malayalam Extra" w:hAnsi="BRH Malayalam Extra" w:cs="BRH Malayalam Extra"/>
+                <w:color w:val="000000"/>
+                <w:sz w:val="32"/>
+                <w:szCs w:val="40"/>
+              </w:rPr>
+              <w:t xml:space="preserve">b§ jb§ jb§ </w:t>
+            </w:r>
+            <w:r>
+              <w:rPr>
+                <w:rFonts w:ascii="BRH Malayalam Extra" w:hAnsi="BRH Malayalam Extra" w:cs="BRH Malayalam Extra"/>
+                <w:color w:val="000000"/>
+                <w:sz w:val="32"/>
+                <w:szCs w:val="40"/>
+                <w:highlight w:val="green"/>
+              </w:rPr>
+              <w:t>ög¢</w:t>
+            </w:r>
+            <w:r>
+              <w:rPr>
+                <w:rFonts w:ascii="BRH Malayalam Extra" w:hAnsi="BRH Malayalam Extra" w:cs="BRH Malayalam Extra"/>
+                <w:color w:val="000000"/>
+                <w:sz w:val="26"/>
+                <w:szCs w:val="40"/>
+                <w:highlight w:val="green"/>
+              </w:rPr>
+              <w:t>–</w:t>
+            </w:r>
+            <w:r>
+              <w:rPr>
+                <w:rFonts w:ascii="BRH Malayalam Extra" w:hAnsi="BRH Malayalam Extra" w:cs="BRH Malayalam Extra"/>
+                <w:color w:val="000000"/>
+                <w:sz w:val="32"/>
+                <w:szCs w:val="40"/>
+                <w:highlight w:val="green"/>
+              </w:rPr>
+              <w:t>jx</w:t>
+            </w:r>
+            <w:r>
+              <w:rPr>
+                <w:rFonts w:ascii="BRH Malayalam Extra" w:hAnsi="BRH Malayalam Extra" w:cs="BRH Malayalam Extra"/>
+                <w:color w:val="000000"/>
+                <w:sz w:val="32"/>
+                <w:szCs w:val="40"/>
+              </w:rPr>
+              <w:t xml:space="preserve"> bMË§— | </w:t>
+            </w:r>
+          </w:p>
+          <w:p>
+            <w:pPr>
+              <w:widowControl w:val="0"/>
+              <w:autoSpaceDE w:val="0"/>
+              <w:autoSpaceDN w:val="0"/>
+              <w:adjustRightInd w:val="0"/>
+              <w:spacing w:before="0" w:line="240" w:lineRule="auto"/>
+              <w:rPr>
+                <w:rFonts w:ascii="BRH Malayalam Extra" w:hAnsi="BRH Malayalam Extra" w:cs="BRH Malayalam Extra"/>
+                <w:color w:val="000000"/>
+                <w:sz w:val="32"/>
+                <w:szCs w:val="40"/>
+              </w:rPr>
+            </w:pPr>
+            <w:r>
+              <w:rPr>
+                <w:rFonts w:cs="BRH Malayalam Extra"/>
+                <w:color w:val="000000"/>
+                <w:szCs w:val="40"/>
+              </w:rPr>
+              <w:t>51</w:t>
+            </w:r>
+            <w:r>
+              <w:rPr>
+                <w:rFonts w:ascii="BRH Malayalam Extra" w:hAnsi="BRH Malayalam Extra" w:cs="BRH Malayalam Extra"/>
+                <w:color w:val="000000"/>
+                <w:sz w:val="32"/>
+                <w:szCs w:val="40"/>
+              </w:rPr>
+              <w:t>)</w:t>
+            </w:r>
+            <w:r>
+              <w:rPr>
+                <w:rFonts w:ascii="BRH Malayalam Extra" w:hAnsi="BRH Malayalam Extra" w:cs="BRH Malayalam Extra"/>
+                <w:color w:val="000000"/>
+                <w:sz w:val="32"/>
+                <w:szCs w:val="40"/>
+              </w:rPr>
+              <w:tab/>
+            </w:r>
+            <w:r>
+              <w:rPr>
+                <w:rFonts w:cs="BRH Malayalam Extra"/>
+                <w:color w:val="000000"/>
+                <w:szCs w:val="40"/>
+              </w:rPr>
+              <w:t>2</w:t>
+            </w:r>
+            <w:r>
+              <w:rPr>
+                <w:rFonts w:ascii="BRH Malayalam Extra" w:hAnsi="BRH Malayalam Extra" w:cs="BRH Malayalam Extra"/>
+                <w:color w:val="000000"/>
+                <w:sz w:val="32"/>
+                <w:szCs w:val="40"/>
+              </w:rPr>
+              <w:t>.</w:t>
+            </w:r>
+            <w:r>
+              <w:rPr>
+                <w:rFonts w:cs="BRH Malayalam Extra"/>
+                <w:color w:val="000000"/>
+                <w:szCs w:val="40"/>
+              </w:rPr>
+              <w:t>6</w:t>
+            </w:r>
+            <w:r>
+              <w:rPr>
+                <w:rFonts w:ascii="BRH Malayalam Extra" w:hAnsi="BRH Malayalam Extra" w:cs="BRH Malayalam Extra"/>
+                <w:color w:val="000000"/>
+                <w:sz w:val="32"/>
+                <w:szCs w:val="40"/>
+              </w:rPr>
+              <w:t>.</w:t>
+            </w:r>
+            <w:r>
+              <w:rPr>
+                <w:rFonts w:cs="BRH Malayalam Extra"/>
+                <w:color w:val="000000"/>
+                <w:szCs w:val="40"/>
+              </w:rPr>
+              <w:t>5</w:t>
+            </w:r>
+            <w:r>
+              <w:rPr>
+                <w:rFonts w:ascii="BRH Malayalam Extra" w:hAnsi="BRH Malayalam Extra" w:cs="BRH Malayalam Extra"/>
+                <w:color w:val="000000"/>
+                <w:sz w:val="32"/>
+                <w:szCs w:val="40"/>
+              </w:rPr>
+              <w:t>.</w:t>
+            </w:r>
+            <w:r>
+              <w:rPr>
+                <w:rFonts w:cs="BRH Malayalam Extra"/>
+                <w:color w:val="000000"/>
+                <w:szCs w:val="40"/>
+              </w:rPr>
+              <w:t>6</w:t>
+            </w:r>
+            <w:r>
+              <w:rPr>
+                <w:rFonts w:ascii="BRH Malayalam Extra" w:hAnsi="BRH Malayalam Extra" w:cs="BRH Malayalam Extra"/>
+                <w:color w:val="000000"/>
+                <w:sz w:val="32"/>
+                <w:szCs w:val="40"/>
+              </w:rPr>
+              <w:t>(</w:t>
+            </w:r>
+            <w:r>
+              <w:rPr>
+                <w:rFonts w:cs="BRH Malayalam Extra"/>
+                <w:color w:val="000000"/>
+                <w:szCs w:val="40"/>
+              </w:rPr>
+              <w:t>47</w:t>
+            </w:r>
+            <w:r>
+              <w:rPr>
+                <w:rFonts w:ascii="BRH Malayalam Extra" w:hAnsi="BRH Malayalam Extra" w:cs="BRH Malayalam Extra"/>
+                <w:color w:val="000000"/>
+                <w:sz w:val="32"/>
+                <w:szCs w:val="40"/>
+              </w:rPr>
+              <w:t>)</w:t>
+            </w:r>
+            <w:proofErr w:type="gramStart"/>
+            <w:r>
+              <w:rPr>
+                <w:rFonts w:ascii="BRH Malayalam Extra" w:hAnsi="BRH Malayalam Extra" w:cs="BRH Malayalam Extra"/>
+                <w:color w:val="000000"/>
+                <w:sz w:val="32"/>
+                <w:szCs w:val="40"/>
+              </w:rPr>
+              <w:t>-  ög</w:t>
+            </w:r>
+            <w:proofErr w:type="gramEnd"/>
+            <w:r>
+              <w:rPr>
+                <w:rFonts w:ascii="BRH Malayalam Extra" w:hAnsi="BRH Malayalam Extra" w:cs="BRH Malayalam Extra"/>
+                <w:color w:val="000000"/>
+                <w:sz w:val="32"/>
+                <w:szCs w:val="40"/>
+              </w:rPr>
+              <w:t>¢</w:t>
+            </w:r>
+            <w:r>
+              <w:rPr>
+                <w:rFonts w:ascii="BRH Malayalam Extra" w:hAnsi="BRH Malayalam Extra" w:cs="BRH Malayalam Extra"/>
+                <w:color w:val="000000"/>
+                <w:sz w:val="26"/>
+                <w:szCs w:val="40"/>
+              </w:rPr>
+              <w:t>–</w:t>
+            </w:r>
+            <w:r>
+              <w:rPr>
+                <w:rFonts w:ascii="BRH Malayalam Extra" w:hAnsi="BRH Malayalam Extra" w:cs="BRH Malayalam Extra"/>
+                <w:color w:val="000000"/>
+                <w:sz w:val="32"/>
+                <w:szCs w:val="40"/>
+                <w:highlight w:val="green"/>
+              </w:rPr>
+              <w:t>jx</w:t>
+            </w:r>
+            <w:r>
+              <w:rPr>
+                <w:rFonts w:ascii="BRH Malayalam Extra" w:hAnsi="BRH Malayalam Extra" w:cs="BRH Malayalam Extra"/>
+                <w:color w:val="000000"/>
+                <w:sz w:val="32"/>
+                <w:szCs w:val="40"/>
+              </w:rPr>
+              <w:t>Z§ | AMË§— | A</w:t>
+            </w:r>
+            <w:r>
+              <w:rPr>
+                <w:rFonts w:ascii="BRH Malayalam Extra" w:hAnsi="BRH Malayalam Extra" w:cs="BRH Malayalam Extra"/>
+                <w:color w:val="000000"/>
+                <w:sz w:val="26"/>
+                <w:szCs w:val="40"/>
+              </w:rPr>
+              <w:t>–</w:t>
+            </w:r>
+            <w:r>
+              <w:rPr>
+                <w:rFonts w:ascii="BRH Malayalam Extra" w:hAnsi="BRH Malayalam Extra" w:cs="BRH Malayalam Extra"/>
+                <w:color w:val="000000"/>
+                <w:sz w:val="32"/>
+                <w:szCs w:val="40"/>
+              </w:rPr>
+              <w:t>²yJ |</w:t>
+            </w:r>
+          </w:p>
+          <w:p>
+            <w:pPr>
+              <w:widowControl w:val="0"/>
+              <w:autoSpaceDE w:val="0"/>
+              <w:autoSpaceDN w:val="0"/>
+              <w:adjustRightInd w:val="0"/>
+              <w:spacing w:before="0" w:line="240" w:lineRule="auto"/>
+              <w:rPr>
+                <w:rFonts w:ascii="BRH Malayalam Extra" w:hAnsi="BRH Malayalam Extra" w:cs="BRH Malayalam Extra"/>
+                <w:color w:val="000000"/>
+                <w:sz w:val="32"/>
+                <w:szCs w:val="40"/>
+              </w:rPr>
+            </w:pPr>
+            <w:r>
+              <w:rPr>
+                <w:rFonts w:ascii="BRH Malayalam Extra" w:hAnsi="BRH Malayalam Extra" w:cs="BRH Malayalam Extra"/>
+                <w:color w:val="000000"/>
+                <w:sz w:val="32"/>
+                <w:szCs w:val="40"/>
+              </w:rPr>
+              <w:t>ög</w:t>
+            </w:r>
+            <w:r>
+              <w:rPr>
+                <w:rFonts w:ascii="BRH Malayalam Extra" w:hAnsi="BRH Malayalam Extra" w:cs="BRH Malayalam Extra"/>
+                <w:color w:val="000000"/>
+                <w:sz w:val="32"/>
+                <w:szCs w:val="40"/>
+                <w:highlight w:val="green"/>
+              </w:rPr>
+              <w:t>¢</w:t>
+            </w:r>
+            <w:r>
+              <w:rPr>
+                <w:rFonts w:ascii="BRH Malayalam Extra" w:hAnsi="BRH Malayalam Extra" w:cs="BRH Malayalam Extra"/>
+                <w:color w:val="000000"/>
+                <w:sz w:val="26"/>
+                <w:szCs w:val="40"/>
+                <w:highlight w:val="green"/>
+              </w:rPr>
+              <w:t>–</w:t>
+            </w:r>
+            <w:r>
+              <w:rPr>
+                <w:rFonts w:ascii="BRH Malayalam Extra" w:hAnsi="BRH Malayalam Extra" w:cs="BRH Malayalam Extra"/>
+                <w:color w:val="000000"/>
+                <w:sz w:val="32"/>
+                <w:szCs w:val="40"/>
+                <w:highlight w:val="green"/>
+              </w:rPr>
+              <w:t>jx</w:t>
+            </w:r>
+            <w:r>
+              <w:rPr>
+                <w:rFonts w:ascii="BRH Malayalam Extra" w:hAnsi="BRH Malayalam Extra" w:cs="BRH Malayalam Extra"/>
+                <w:color w:val="000000"/>
+                <w:sz w:val="32"/>
+                <w:szCs w:val="40"/>
+              </w:rPr>
+              <w:t xml:space="preserve"> bM</w:t>
+            </w:r>
+            <w:r>
+              <w:rPr>
+                <w:rFonts w:ascii="BRH Malayalam Extra" w:hAnsi="BRH Malayalam Extra" w:cs="BRH Malayalam Extra"/>
+                <w:color w:val="000000"/>
+                <w:sz w:val="26"/>
+                <w:szCs w:val="40"/>
+              </w:rPr>
+              <w:t>–</w:t>
+            </w:r>
+            <w:r>
+              <w:rPr>
+                <w:rFonts w:ascii="BRH Malayalam Extra" w:hAnsi="BRH Malayalam Extra" w:cs="BRH Malayalam Extra"/>
+                <w:color w:val="000000"/>
+                <w:sz w:val="32"/>
+                <w:szCs w:val="40"/>
+              </w:rPr>
+              <w:t xml:space="preserve">© dM—© </w:t>
+            </w:r>
+            <w:r>
+              <w:rPr>
+                <w:rFonts w:ascii="BRH Malayalam Extra" w:hAnsi="BRH Malayalam Extra" w:cs="BRH Malayalam Extra"/>
+                <w:color w:val="000000"/>
+                <w:sz w:val="32"/>
+                <w:szCs w:val="40"/>
+                <w:highlight w:val="green"/>
+              </w:rPr>
+              <w:t>ög¢</w:t>
+            </w:r>
+            <w:r>
+              <w:rPr>
+                <w:rFonts w:ascii="BRH Malayalam Extra" w:hAnsi="BRH Malayalam Extra" w:cs="BRH Malayalam Extra"/>
+                <w:color w:val="000000"/>
+                <w:sz w:val="26"/>
+                <w:szCs w:val="40"/>
+              </w:rPr>
+              <w:t>–</w:t>
+            </w:r>
+            <w:r>
+              <w:rPr>
+                <w:rFonts w:ascii="BRH Malayalam Extra" w:hAnsi="BRH Malayalam Extra" w:cs="BRH Malayalam Extra"/>
+                <w:color w:val="000000"/>
+                <w:sz w:val="32"/>
+                <w:szCs w:val="40"/>
+              </w:rPr>
+              <w:t xml:space="preserve">jxb§ </w:t>
+            </w:r>
+            <w:r>
+              <w:rPr>
+                <w:rFonts w:ascii="BRH Malayalam Extra" w:hAnsi="BRH Malayalam Extra" w:cs="BRH Malayalam Extra"/>
+                <w:color w:val="000000"/>
+                <w:sz w:val="32"/>
+                <w:szCs w:val="40"/>
+                <w:highlight w:val="green"/>
+              </w:rPr>
+              <w:t>ög¢</w:t>
+            </w:r>
+            <w:r>
+              <w:rPr>
+                <w:rFonts w:ascii="BRH Malayalam Extra" w:hAnsi="BRH Malayalam Extra" w:cs="BRH Malayalam Extra"/>
+                <w:color w:val="000000"/>
+                <w:sz w:val="26"/>
+                <w:szCs w:val="40"/>
+                <w:highlight w:val="green"/>
+              </w:rPr>
+              <w:t>–</w:t>
+            </w:r>
+            <w:r>
+              <w:rPr>
+                <w:rFonts w:ascii="BRH Malayalam Extra" w:hAnsi="BRH Malayalam Extra" w:cs="BRH Malayalam Extra"/>
+                <w:color w:val="000000"/>
+                <w:sz w:val="32"/>
+                <w:szCs w:val="40"/>
+                <w:highlight w:val="green"/>
+              </w:rPr>
+              <w:t>jx</w:t>
+            </w:r>
+            <w:r>
+              <w:rPr>
+                <w:rFonts w:ascii="BRH Malayalam Extra" w:hAnsi="BRH Malayalam Extra" w:cs="BRH Malayalam Extra"/>
+                <w:color w:val="000000"/>
+                <w:sz w:val="32"/>
+                <w:szCs w:val="40"/>
+              </w:rPr>
+              <w:t xml:space="preserve"> bM—© d</w:t>
+            </w:r>
+            <w:r>
+              <w:rPr>
+                <w:rFonts w:ascii="BRH Malayalam Extra" w:hAnsi="BRH Malayalam Extra" w:cs="BRH Malayalam Extra"/>
+                <w:color w:val="000000"/>
+                <w:sz w:val="26"/>
+                <w:szCs w:val="40"/>
+              </w:rPr>
+              <w:t>–</w:t>
+            </w:r>
+            <w:r>
+              <w:rPr>
+                <w:rFonts w:ascii="BRH Malayalam Extra" w:hAnsi="BRH Malayalam Extra" w:cs="BRH Malayalam Extra"/>
+                <w:color w:val="000000"/>
+                <w:sz w:val="32"/>
+                <w:szCs w:val="40"/>
+              </w:rPr>
+              <w:t xml:space="preserve">²y </w:t>
+            </w:r>
+          </w:p>
+          <w:p>
+            <w:pPr>
+              <w:widowControl w:val="0"/>
+              <w:autoSpaceDE w:val="0"/>
+              <w:autoSpaceDN w:val="0"/>
+              <w:adjustRightInd w:val="0"/>
+              <w:spacing w:before="0" w:line="240" w:lineRule="auto"/>
+              <w:rPr>
+                <w:rFonts w:ascii="BRH Malayalam Extra" w:hAnsi="BRH Malayalam Extra" w:cs="BRH Malayalam Extra"/>
+                <w:color w:val="000000"/>
+                <w:sz w:val="32"/>
+                <w:szCs w:val="40"/>
+              </w:rPr>
+            </w:pPr>
+            <w:r>
+              <w:rPr>
+                <w:rFonts w:ascii="BRH Malayalam Extra" w:hAnsi="BRH Malayalam Extra" w:cs="BRH Malayalam Extra"/>
+                <w:color w:val="000000"/>
+                <w:sz w:val="32"/>
+                <w:szCs w:val="40"/>
+              </w:rPr>
+              <w:t>k</w:t>
+            </w:r>
+            <w:r>
+              <w:rPr>
+                <w:rFonts w:ascii="BRH Malayalam Extra" w:hAnsi="BRH Malayalam Extra" w:cs="BRH Malayalam Extra"/>
+                <w:color w:val="000000"/>
+                <w:sz w:val="26"/>
+                <w:szCs w:val="40"/>
+              </w:rPr>
+              <w:t>–</w:t>
+            </w:r>
+            <w:r>
+              <w:rPr>
+                <w:rFonts w:ascii="BRH Malayalam Extra" w:hAnsi="BRH Malayalam Extra" w:cs="BRH Malayalam Extra"/>
+                <w:color w:val="000000"/>
+                <w:sz w:val="32"/>
+                <w:szCs w:val="40"/>
+              </w:rPr>
+              <w:t xml:space="preserve">²y kM—© </w:t>
+            </w:r>
+            <w:r>
+              <w:rPr>
+                <w:rFonts w:ascii="BRH Malayalam Extra" w:hAnsi="BRH Malayalam Extra" w:cs="BRH Malayalam Extra"/>
+                <w:color w:val="000000"/>
+                <w:sz w:val="32"/>
+                <w:szCs w:val="40"/>
+                <w:highlight w:val="green"/>
+              </w:rPr>
+              <w:t>ög¢</w:t>
+            </w:r>
+            <w:r>
+              <w:rPr>
+                <w:rFonts w:ascii="BRH Malayalam Extra" w:hAnsi="BRH Malayalam Extra" w:cs="BRH Malayalam Extra"/>
+                <w:color w:val="000000"/>
+                <w:sz w:val="26"/>
+                <w:szCs w:val="40"/>
+              </w:rPr>
+              <w:t>–</w:t>
+            </w:r>
+            <w:r>
+              <w:rPr>
+                <w:rFonts w:ascii="BRH Malayalam Extra" w:hAnsi="BRH Malayalam Extra" w:cs="BRH Malayalam Extra"/>
+                <w:color w:val="000000"/>
+                <w:sz w:val="32"/>
+                <w:szCs w:val="40"/>
+              </w:rPr>
+              <w:t xml:space="preserve">jxb§ </w:t>
+            </w:r>
+            <w:r>
+              <w:rPr>
+                <w:rFonts w:ascii="BRH Malayalam Extra" w:hAnsi="BRH Malayalam Extra" w:cs="BRH Malayalam Extra"/>
+                <w:color w:val="000000"/>
+                <w:sz w:val="32"/>
+                <w:szCs w:val="40"/>
+                <w:highlight w:val="green"/>
+              </w:rPr>
+              <w:t>ög¢</w:t>
+            </w:r>
+            <w:r>
+              <w:rPr>
+                <w:rFonts w:ascii="BRH Malayalam Extra" w:hAnsi="BRH Malayalam Extra" w:cs="BRH Malayalam Extra"/>
+                <w:color w:val="000000"/>
+                <w:sz w:val="26"/>
+                <w:szCs w:val="40"/>
+                <w:highlight w:val="green"/>
+              </w:rPr>
+              <w:t>–</w:t>
+            </w:r>
+            <w:r>
+              <w:rPr>
+                <w:rFonts w:ascii="BRH Malayalam Extra" w:hAnsi="BRH Malayalam Extra" w:cs="BRH Malayalam Extra"/>
+                <w:color w:val="000000"/>
+                <w:sz w:val="32"/>
+                <w:szCs w:val="40"/>
+                <w:highlight w:val="green"/>
+              </w:rPr>
+              <w:t>jx</w:t>
+            </w:r>
+            <w:r>
+              <w:rPr>
+                <w:rFonts w:ascii="BRH Malayalam Extra" w:hAnsi="BRH Malayalam Extra" w:cs="BRH Malayalam Extra"/>
+                <w:color w:val="000000"/>
+                <w:sz w:val="32"/>
+                <w:szCs w:val="40"/>
+              </w:rPr>
+              <w:t xml:space="preserve"> bM—© d</w:t>
+            </w:r>
+            <w:r>
+              <w:rPr>
+                <w:rFonts w:ascii="BRH Malayalam Extra" w:hAnsi="BRH Malayalam Extra" w:cs="BRH Malayalam Extra"/>
+                <w:color w:val="000000"/>
+                <w:sz w:val="26"/>
+                <w:szCs w:val="40"/>
+              </w:rPr>
+              <w:t>–</w:t>
+            </w:r>
+            <w:r>
+              <w:rPr>
+                <w:rFonts w:ascii="BRH Malayalam Extra" w:hAnsi="BRH Malayalam Extra" w:cs="BRH Malayalam Extra"/>
+                <w:color w:val="000000"/>
+                <w:sz w:val="32"/>
+                <w:szCs w:val="40"/>
+              </w:rPr>
+              <w:t xml:space="preserve">²yJ | </w:t>
+            </w:r>
+          </w:p>
+          <w:p>
+            <w:pPr>
+              <w:widowControl w:val="0"/>
+              <w:autoSpaceDE w:val="0"/>
+              <w:autoSpaceDN w:val="0"/>
+              <w:adjustRightInd w:val="0"/>
+              <w:spacing w:before="0" w:line="240" w:lineRule="auto"/>
+              <w:rPr>
+                <w:rFonts w:cs="BRH Malayalam Extra"/>
+                <w:szCs w:val="40"/>
+              </w:rPr>
+            </w:pPr>
+          </w:p>
+        </w:tc>
+      </w:tr>
+      <w:tr>
+        <w:trPr>
+          <w:trHeight w:val="488"/>
+        </w:trPr>
+        <w:tc>
+          <w:tcPr>
+            <w:tcW w:w="7166" w:type="dxa"/>
+          </w:tcPr>
+          <w:p>
+            <w:pPr>
+              <w:widowControl w:val="0"/>
+              <w:autoSpaceDE w:val="0"/>
+              <w:autoSpaceDN w:val="0"/>
+              <w:adjustRightInd w:val="0"/>
+              <w:spacing w:before="0" w:line="240" w:lineRule="auto"/>
+              <w:rPr>
+                <w:rFonts w:cs="BRH Malayalam Extra"/>
+                <w:szCs w:val="40"/>
+              </w:rPr>
+            </w:pPr>
+          </w:p>
+        </w:tc>
+        <w:tc>
+          <w:tcPr>
+            <w:tcW w:w="7371" w:type="dxa"/>
+          </w:tcPr>
+          <w:p>
+            <w:pPr>
+              <w:widowControl w:val="0"/>
+              <w:autoSpaceDE w:val="0"/>
+              <w:autoSpaceDN w:val="0"/>
+              <w:adjustRightInd w:val="0"/>
+              <w:spacing w:before="0" w:line="240" w:lineRule="auto"/>
+              <w:rPr>
+                <w:rFonts w:cs="BRH Malayalam Extra"/>
+                <w:szCs w:val="40"/>
+              </w:rPr>
+            </w:pPr>
+          </w:p>
+        </w:tc>
+      </w:tr>
+    </w:tbl>
+    <w:p>
+      <w:pPr>
+        <w:spacing w:before="0" w:line="240" w:lineRule="auto"/>
+        <w:jc w:val="center"/>
+        <w:rPr>
+          <w:b/>
+          <w:bCs/>
+          <w:sz w:val="32"/>
+          <w:szCs w:val="32"/>
+          <w:u w:val="single"/>
+        </w:rPr>
+      </w:pPr>
+    </w:p>
+    <w:p>
+      <w:pPr>
+        <w:spacing w:before="0" w:line="240" w:lineRule="auto"/>
+        <w:jc w:val="center"/>
+        <w:rPr>
+          <w:b/>
+          <w:bCs/>
+          <w:sz w:val="32"/>
+          <w:szCs w:val="32"/>
+          <w:u w:val="single"/>
+        </w:rPr>
+      </w:pPr>
+    </w:p>
+    <w:p>
+      <w:pPr>
+        <w:spacing w:before="0" w:line="240" w:lineRule="auto"/>
+        <w:jc w:val="center"/>
+        <w:rPr>
+          <w:b/>
+          <w:bCs/>
+          <w:sz w:val="32"/>
+          <w:szCs w:val="32"/>
+          <w:u w:val="single"/>
+        </w:rPr>
+      </w:pPr>
+    </w:p>
     <w:p>
       <w:pPr>
         <w:spacing w:before="0" w:line="240" w:lineRule="auto"/>
@@ -123,27 +2986,7 @@
           <w:sz w:val="28"/>
           <w:szCs w:val="32"/>
         </w:rPr>
-        <w:t>(</w:t>
-      </w:r>
-      <w:proofErr w:type="gramStart"/>
-      <w:r>
-        <w:rPr>
-          <w:b/>
-          <w:bCs/>
-          <w:sz w:val="28"/>
-          <w:szCs w:val="32"/>
-        </w:rPr>
-        <w:t>ignore</w:t>
-      </w:r>
-      <w:proofErr w:type="gramEnd"/>
-      <w:r>
-        <w:rPr>
-          <w:b/>
-          <w:bCs/>
-          <w:sz w:val="28"/>
-          <w:szCs w:val="32"/>
-        </w:rPr>
-        <w:t xml:space="preserve"> those which are already incorporated in your book’s version and date)</w:t>
+        <w:t>(ignore those which are already incorporated in your book’s version and date)</w:t>
       </w:r>
     </w:p>
     <w:tbl>
@@ -251,6 +3094,7 @@
                 <w:color w:val="000000"/>
                 <w:szCs w:val="40"/>
               </w:rPr>
+              <w:lastRenderedPageBreak/>
               <w:t>34</w:t>
             </w:r>
             <w:r>
@@ -6296,7 +9140,6 @@
                 <w:szCs w:val="40"/>
                 <w:lang w:val="it-IT"/>
               </w:rPr>
-              <w:lastRenderedPageBreak/>
               <w:t>49</w:t>
             </w:r>
             <w:r>
@@ -6497,6 +9340,7 @@
                 <w:szCs w:val="40"/>
                 <w:lang w:val="it-IT"/>
               </w:rPr>
+              <w:lastRenderedPageBreak/>
               <w:t>e¡</w:t>
             </w:r>
             <w:r>
@@ -8629,7 +11473,6 @@
                 <w:szCs w:val="40"/>
                 <w:lang w:val="it-IT"/>
               </w:rPr>
-              <w:lastRenderedPageBreak/>
               <w:t>49</w:t>
             </w:r>
             <w:r>
@@ -8810,6 +11653,7 @@
                 <w:szCs w:val="40"/>
                 <w:lang w:val="it-IT"/>
               </w:rPr>
+              <w:lastRenderedPageBreak/>
               <w:t>e¡</w:t>
             </w:r>
             <w:r>
@@ -15334,7 +18178,6 @@
                 <w:szCs w:val="40"/>
                 <w:lang w:val="it-IT"/>
               </w:rPr>
-              <w:lastRenderedPageBreak/>
               <w:t>e¡</w:t>
             </w:r>
             <w:r>
@@ -15483,6 +18326,7 @@
                 <w:szCs w:val="40"/>
                 <w:lang w:val="it-IT"/>
               </w:rPr>
+              <w:lastRenderedPageBreak/>
               <w:t>e¡</w:t>
             </w:r>
             <w:r>
@@ -17963,7 +20807,6 @@
                 <w:szCs w:val="40"/>
                 <w:lang w:val="it-IT"/>
               </w:rPr>
-              <w:lastRenderedPageBreak/>
               <w:t>e¡</w:t>
             </w:r>
             <w:r>
@@ -18092,6 +20935,7 @@
                 <w:szCs w:val="40"/>
                 <w:lang w:val="it-IT"/>
               </w:rPr>
+              <w:lastRenderedPageBreak/>
               <w:t>e¡</w:t>
             </w:r>
             <w:r>
@@ -48596,7 +51440,6 @@
                 <w:color w:val="000000"/>
                 <w:szCs w:val="40"/>
               </w:rPr>
-              <w:lastRenderedPageBreak/>
               <w:t>30</w:t>
             </w:r>
             <w:r>
@@ -49112,6 +51955,7 @@
                 <w:color w:val="000000"/>
                 <w:szCs w:val="40"/>
               </w:rPr>
+              <w:lastRenderedPageBreak/>
               <w:t>16</w:t>
             </w:r>
             <w:r>
@@ -49756,27 +52600,7 @@
           <w:sz w:val="28"/>
           <w:szCs w:val="32"/>
         </w:rPr>
-        <w:t>(</w:t>
-      </w:r>
-      <w:proofErr w:type="gramStart"/>
-      <w:r>
-        <w:rPr>
-          <w:b/>
-          <w:bCs/>
-          <w:sz w:val="28"/>
-          <w:szCs w:val="32"/>
-        </w:rPr>
-        <w:t>ignore</w:t>
-      </w:r>
-      <w:proofErr w:type="gramEnd"/>
-      <w:r>
-        <w:rPr>
-          <w:b/>
-          <w:bCs/>
-          <w:sz w:val="28"/>
-          <w:szCs w:val="32"/>
-        </w:rPr>
-        <w:t xml:space="preserve"> those which are already incorporated in your book’s version and date)</w:t>
+        <w:t>(ignore those which are already incorporated in your book’s version and date)</w:t>
       </w:r>
     </w:p>
     <w:tbl>
@@ -50072,7 +52896,7 @@
 </file>
 
 <file path=word/endnotes.xml><?xml version="1.0" encoding="utf-8"?>
-<w:endnotes xmlns:wpc="http://schemas.microsoft.com/office/word/2010/wordprocessingCanvas" xmlns:cx="http://schemas.microsoft.com/office/drawing/2014/chartex" xmlns:cx1="http://schemas.microsoft.com/office/drawing/2015/9/8/chartex" xmlns:cx2="http://schemas.microsoft.com/office/drawing/2015/10/21/chartex" xmlns:cx3="http://schemas.microsoft.com/office/drawing/2016/5/9/chartex" xmlns:cx4="http://schemas.microsoft.com/office/drawing/2016/5/10/chartex" xmlns:cx5="http://schemas.microsoft.com/office/drawing/2016/5/11/chartex" xmlns:cx6="http://schemas.microsoft.com/office/drawing/2016/5/12/chartex" xmlns:cx7="http://schemas.microsoft.com/office/drawing/2016/5/13/chartex" xmlns:cx8="http://schemas.microsoft.com/office/drawing/2016/5/14/chartex" xmlns:mc="http://schemas.openxmlformats.org/markup-compatibility/2006" xmlns:aink="http://schemas.microsoft.com/office/drawing/2016/ink" xmlns:am3d="http://schemas.microsoft.com/office/drawing/2017/model3d" xmlns:o="urn:schemas-microsoft-com:office:office" xmlns:oel="http://schemas.microsoft.com/office/2019/extlst" xmlns:r="http://schemas.openxmlformats.org/officeDocument/2006/relationships" xmlns:m="http://schemas.openxmlformats.org/officeDocument/2006/math" xmlns:v="urn:schemas-microsoft-com:vml" xmlns:wp14="http://schemas.microsoft.com/office/word/2010/wordprocessingDrawing" xmlns:wp="http://schemas.openxmlformats.org/drawingml/2006/wordprocessingDrawing" xmlns:w10="urn:schemas-microsoft-com:office:word" xmlns:w="http://schemas.openxmlformats.org/wordprocessingml/2006/main" xmlns:w14="http://schemas.microsoft.com/office/word/2010/wordml" xmlns:w15="http://schemas.microsoft.com/office/word/2012/wordml" xmlns:w16cex="http://schemas.microsoft.com/office/word/2018/wordml/cex" xmlns:w16cid="http://schemas.microsoft.com/office/word/2016/wordml/cid" xmlns:w16="http://schemas.microsoft.com/office/word/2018/wordml" xmlns:w16sdtdh="http://schemas.microsoft.com/office/word/2020/wordml/sdtdatahash" xmlns:w16se="http://schemas.microsoft.com/office/word/2015/wordml/symex" xmlns:wpg="http://schemas.microsoft.com/office/word/2010/wordprocessingGroup" xmlns:wpi="http://schemas.microsoft.com/office/word/2010/wordprocessingInk" xmlns:wne="http://schemas.microsoft.com/office/word/2006/wordml" xmlns:wps="http://schemas.microsoft.com/office/word/2010/wordprocessingShape" mc:Ignorable="w14 w15 w16se w16cid w16 w16cex w16sdtdh wp14">
+<w:endnotes xmlns:wpc="http://schemas.microsoft.com/office/word/2010/wordprocessingCanvas" xmlns:cx="http://schemas.microsoft.com/office/drawing/2014/chartex" xmlns:cx1="http://schemas.microsoft.com/office/drawing/2015/9/8/chartex" xmlns:cx2="http://schemas.microsoft.com/office/drawing/2015/10/21/chartex" xmlns:cx3="http://schemas.microsoft.com/office/drawing/2016/5/9/chartex" xmlns:cx4="http://schemas.microsoft.com/office/drawing/2016/5/10/chartex" xmlns:cx5="http://schemas.microsoft.com/office/drawing/2016/5/11/chartex" xmlns:cx6="http://schemas.microsoft.com/office/drawing/2016/5/12/chartex" xmlns:cx7="http://schemas.microsoft.com/office/drawing/2016/5/13/chartex" xmlns:cx8="http://schemas.microsoft.com/office/drawing/2016/5/14/chartex" xmlns:mc="http://schemas.openxmlformats.org/markup-compatibility/2006" xmlns:aink="http://schemas.microsoft.com/office/drawing/2016/ink" xmlns:am3d="http://schemas.microsoft.com/office/drawing/2017/model3d" xmlns:o="urn:schemas-microsoft-com:office:office" xmlns:oel="http://schemas.microsoft.com/office/2019/extlst" xmlns:r="http://schemas.openxmlformats.org/officeDocument/2006/relationships" xmlns:m="http://schemas.openxmlformats.org/officeDocument/2006/math" xmlns:v="urn:schemas-microsoft-com:vml" xmlns:wp14="http://schemas.microsoft.com/office/word/2010/wordprocessingDrawing" xmlns:wp="http://schemas.openxmlformats.org/drawingml/2006/wordprocessingDrawing" xmlns:w10="urn:schemas-microsoft-com:office:word" xmlns:w="http://schemas.openxmlformats.org/wordprocessingml/2006/main" xmlns:w14="http://schemas.microsoft.com/office/word/2010/wordml" xmlns:w15="http://schemas.microsoft.com/office/word/2012/wordml" xmlns:w16cex="http://schemas.microsoft.com/office/word/2018/wordml/cex" xmlns:w16cid="http://schemas.microsoft.com/office/word/2016/wordml/cid" xmlns:w16="http://schemas.microsoft.com/office/word/2018/wordml" xmlns:w16du="http://schemas.microsoft.com/office/word/2023/wordml/word16du" xmlns:w16sdtdh="http://schemas.microsoft.com/office/word/2020/wordml/sdtdatahash" xmlns:w16sdtfl="http://schemas.microsoft.com/office/word/2024/wordml/sdtformatlock" xmlns:w16se="http://schemas.microsoft.com/office/word/2015/wordml/symex" xmlns:wpg="http://schemas.microsoft.com/office/word/2010/wordprocessingGroup" xmlns:wpi="http://schemas.microsoft.com/office/word/2010/wordprocessingInk" xmlns:wne="http://schemas.microsoft.com/office/word/2006/wordml" xmlns:wps="http://schemas.microsoft.com/office/word/2010/wordprocessingShape" mc:Ignorable="w14 w15 w16se w16cid w16 w16cex w16sdtdh w16sdtfl w16du wp14">
   <w:endnote w:type="separator" w:id="-1">
     <w:p>
       <w:pPr>
@@ -50097,7 +52921,7 @@
 </file>
 
 <file path=word/footer1.xml><?xml version="1.0" encoding="utf-8"?>
-<w:ftr xmlns:wpc="http://schemas.microsoft.com/office/word/2010/wordprocessingCanvas" xmlns:cx="http://schemas.microsoft.com/office/drawing/2014/chartex" xmlns:cx1="http://schemas.microsoft.com/office/drawing/2015/9/8/chartex" xmlns:cx2="http://schemas.microsoft.com/office/drawing/2015/10/21/chartex" xmlns:cx3="http://schemas.microsoft.com/office/drawing/2016/5/9/chartex" xmlns:cx4="http://schemas.microsoft.com/office/drawing/2016/5/10/chartex" xmlns:cx5="http://schemas.microsoft.com/office/drawing/2016/5/11/chartex" xmlns:cx6="http://schemas.microsoft.com/office/drawing/2016/5/12/chartex" xmlns:cx7="http://schemas.microsoft.com/office/drawing/2016/5/13/chartex" xmlns:cx8="http://schemas.microsoft.com/office/drawing/2016/5/14/chartex" xmlns:mc="http://schemas.openxmlformats.org/markup-compatibility/2006" xmlns:aink="http://schemas.microsoft.com/office/drawing/2016/ink" xmlns:am3d="http://schemas.microsoft.com/office/drawing/2017/model3d" xmlns:o="urn:schemas-microsoft-com:office:office" xmlns:oel="http://schemas.microsoft.com/office/2019/extlst" xmlns:r="http://schemas.openxmlformats.org/officeDocument/2006/relationships" xmlns:m="http://schemas.openxmlformats.org/officeDocument/2006/math" xmlns:v="urn:schemas-microsoft-com:vml" xmlns:wp14="http://schemas.microsoft.com/office/word/2010/wordprocessingDrawing" xmlns:wp="http://schemas.openxmlformats.org/drawingml/2006/wordprocessingDrawing" xmlns:w10="urn:schemas-microsoft-com:office:word" xmlns:w="http://schemas.openxmlformats.org/wordprocessingml/2006/main" xmlns:w14="http://schemas.microsoft.com/office/word/2010/wordml" xmlns:w15="http://schemas.microsoft.com/office/word/2012/wordml" xmlns:w16cex="http://schemas.microsoft.com/office/word/2018/wordml/cex" xmlns:w16cid="http://schemas.microsoft.com/office/word/2016/wordml/cid" xmlns:w16="http://schemas.microsoft.com/office/word/2018/wordml" xmlns:w16sdtdh="http://schemas.microsoft.com/office/word/2020/wordml/sdtdatahash" xmlns:w16se="http://schemas.microsoft.com/office/word/2015/wordml/symex" xmlns:wpg="http://schemas.microsoft.com/office/word/2010/wordprocessingGroup" xmlns:wpi="http://schemas.microsoft.com/office/word/2010/wordprocessingInk" xmlns:wne="http://schemas.microsoft.com/office/word/2006/wordml" xmlns:wps="http://schemas.microsoft.com/office/word/2010/wordprocessingShape" mc:Ignorable="w14 w15 w16se w16cid w16 w16cex w16sdtdh wp14">
+<w:ftr xmlns:wpc="http://schemas.microsoft.com/office/word/2010/wordprocessingCanvas" xmlns:cx="http://schemas.microsoft.com/office/drawing/2014/chartex" xmlns:cx1="http://schemas.microsoft.com/office/drawing/2015/9/8/chartex" xmlns:cx2="http://schemas.microsoft.com/office/drawing/2015/10/21/chartex" xmlns:cx3="http://schemas.microsoft.com/office/drawing/2016/5/9/chartex" xmlns:cx4="http://schemas.microsoft.com/office/drawing/2016/5/10/chartex" xmlns:cx5="http://schemas.microsoft.com/office/drawing/2016/5/11/chartex" xmlns:cx6="http://schemas.microsoft.com/office/drawing/2016/5/12/chartex" xmlns:cx7="http://schemas.microsoft.com/office/drawing/2016/5/13/chartex" xmlns:cx8="http://schemas.microsoft.com/office/drawing/2016/5/14/chartex" xmlns:mc="http://schemas.openxmlformats.org/markup-compatibility/2006" xmlns:aink="http://schemas.microsoft.com/office/drawing/2016/ink" xmlns:am3d="http://schemas.microsoft.com/office/drawing/2017/model3d" xmlns:o="urn:schemas-microsoft-com:office:office" xmlns:oel="http://schemas.microsoft.com/office/2019/extlst" xmlns:r="http://schemas.openxmlformats.org/officeDocument/2006/relationships" xmlns:m="http://schemas.openxmlformats.org/officeDocument/2006/math" xmlns:v="urn:schemas-microsoft-com:vml" xmlns:wp14="http://schemas.microsoft.com/office/word/2010/wordprocessingDrawing" xmlns:wp="http://schemas.openxmlformats.org/drawingml/2006/wordprocessingDrawing" xmlns:w10="urn:schemas-microsoft-com:office:word" xmlns:w="http://schemas.openxmlformats.org/wordprocessingml/2006/main" xmlns:w14="http://schemas.microsoft.com/office/word/2010/wordml" xmlns:w15="http://schemas.microsoft.com/office/word/2012/wordml" xmlns:w16cex="http://schemas.microsoft.com/office/word/2018/wordml/cex" xmlns:w16cid="http://schemas.microsoft.com/office/word/2016/wordml/cid" xmlns:w16="http://schemas.microsoft.com/office/word/2018/wordml" xmlns:w16du="http://schemas.microsoft.com/office/word/2023/wordml/word16du" xmlns:w16sdtdh="http://schemas.microsoft.com/office/word/2020/wordml/sdtdatahash" xmlns:w16sdtfl="http://schemas.microsoft.com/office/word/2024/wordml/sdtformatlock" xmlns:w16se="http://schemas.microsoft.com/office/word/2015/wordml/symex" xmlns:wpg="http://schemas.microsoft.com/office/word/2010/wordprocessingGroup" xmlns:wpi="http://schemas.microsoft.com/office/word/2010/wordprocessingInk" xmlns:wne="http://schemas.microsoft.com/office/word/2006/wordml" xmlns:wps="http://schemas.microsoft.com/office/word/2010/wordprocessingShape" mc:Ignorable="w14 w15 w16se w16cid w16 w16cex w16sdtdh w16sdtfl w16du wp14">
   <w:p>
     <w:pPr>
       <w:pBdr>
@@ -50279,7 +53103,7 @@
 </file>
 
 <file path=word/footer2.xml><?xml version="1.0" encoding="utf-8"?>
-<w:ftr xmlns:wpc="http://schemas.microsoft.com/office/word/2010/wordprocessingCanvas" xmlns:cx="http://schemas.microsoft.com/office/drawing/2014/chartex" xmlns:cx1="http://schemas.microsoft.com/office/drawing/2015/9/8/chartex" xmlns:cx2="http://schemas.microsoft.com/office/drawing/2015/10/21/chartex" xmlns:cx3="http://schemas.microsoft.com/office/drawing/2016/5/9/chartex" xmlns:cx4="http://schemas.microsoft.com/office/drawing/2016/5/10/chartex" xmlns:cx5="http://schemas.microsoft.com/office/drawing/2016/5/11/chartex" xmlns:cx6="http://schemas.microsoft.com/office/drawing/2016/5/12/chartex" xmlns:cx7="http://schemas.microsoft.com/office/drawing/2016/5/13/chartex" xmlns:cx8="http://schemas.microsoft.com/office/drawing/2016/5/14/chartex" xmlns:mc="http://schemas.openxmlformats.org/markup-compatibility/2006" xmlns:aink="http://schemas.microsoft.com/office/drawing/2016/ink" xmlns:am3d="http://schemas.microsoft.com/office/drawing/2017/model3d" xmlns:o="urn:schemas-microsoft-com:office:office" xmlns:oel="http://schemas.microsoft.com/office/2019/extlst" xmlns:r="http://schemas.openxmlformats.org/officeDocument/2006/relationships" xmlns:m="http://schemas.openxmlformats.org/officeDocument/2006/math" xmlns:v="urn:schemas-microsoft-com:vml" xmlns:wp14="http://schemas.microsoft.com/office/word/2010/wordprocessingDrawing" xmlns:wp="http://schemas.openxmlformats.org/drawingml/2006/wordprocessingDrawing" xmlns:w10="urn:schemas-microsoft-com:office:word" xmlns:w="http://schemas.openxmlformats.org/wordprocessingml/2006/main" xmlns:w14="http://schemas.microsoft.com/office/word/2010/wordml" xmlns:w15="http://schemas.microsoft.com/office/word/2012/wordml" xmlns:w16cex="http://schemas.microsoft.com/office/word/2018/wordml/cex" xmlns:w16cid="http://schemas.microsoft.com/office/word/2016/wordml/cid" xmlns:w16="http://schemas.microsoft.com/office/word/2018/wordml" xmlns:w16sdtdh="http://schemas.microsoft.com/office/word/2020/wordml/sdtdatahash" xmlns:w16se="http://schemas.microsoft.com/office/word/2015/wordml/symex" xmlns:wpg="http://schemas.microsoft.com/office/word/2010/wordprocessingGroup" xmlns:wpi="http://schemas.microsoft.com/office/word/2010/wordprocessingInk" xmlns:wne="http://schemas.microsoft.com/office/word/2006/wordml" xmlns:wps="http://schemas.microsoft.com/office/word/2010/wordprocessingShape" mc:Ignorable="w14 w15 w16se w16cid w16 w16cex w16sdtdh wp14">
+<w:ftr xmlns:wpc="http://schemas.microsoft.com/office/word/2010/wordprocessingCanvas" xmlns:cx="http://schemas.microsoft.com/office/drawing/2014/chartex" xmlns:cx1="http://schemas.microsoft.com/office/drawing/2015/9/8/chartex" xmlns:cx2="http://schemas.microsoft.com/office/drawing/2015/10/21/chartex" xmlns:cx3="http://schemas.microsoft.com/office/drawing/2016/5/9/chartex" xmlns:cx4="http://schemas.microsoft.com/office/drawing/2016/5/10/chartex" xmlns:cx5="http://schemas.microsoft.com/office/drawing/2016/5/11/chartex" xmlns:cx6="http://schemas.microsoft.com/office/drawing/2016/5/12/chartex" xmlns:cx7="http://schemas.microsoft.com/office/drawing/2016/5/13/chartex" xmlns:cx8="http://schemas.microsoft.com/office/drawing/2016/5/14/chartex" xmlns:mc="http://schemas.openxmlformats.org/markup-compatibility/2006" xmlns:aink="http://schemas.microsoft.com/office/drawing/2016/ink" xmlns:am3d="http://schemas.microsoft.com/office/drawing/2017/model3d" xmlns:o="urn:schemas-microsoft-com:office:office" xmlns:oel="http://schemas.microsoft.com/office/2019/extlst" xmlns:r="http://schemas.openxmlformats.org/officeDocument/2006/relationships" xmlns:m="http://schemas.openxmlformats.org/officeDocument/2006/math" xmlns:v="urn:schemas-microsoft-com:vml" xmlns:wp14="http://schemas.microsoft.com/office/word/2010/wordprocessingDrawing" xmlns:wp="http://schemas.openxmlformats.org/drawingml/2006/wordprocessingDrawing" xmlns:w10="urn:schemas-microsoft-com:office:word" xmlns:w="http://schemas.openxmlformats.org/wordprocessingml/2006/main" xmlns:w14="http://schemas.microsoft.com/office/word/2010/wordml" xmlns:w15="http://schemas.microsoft.com/office/word/2012/wordml" xmlns:w16cex="http://schemas.microsoft.com/office/word/2018/wordml/cex" xmlns:w16cid="http://schemas.microsoft.com/office/word/2016/wordml/cid" xmlns:w16="http://schemas.microsoft.com/office/word/2018/wordml" xmlns:w16du="http://schemas.microsoft.com/office/word/2023/wordml/word16du" xmlns:w16sdtdh="http://schemas.microsoft.com/office/word/2020/wordml/sdtdatahash" xmlns:w16sdtfl="http://schemas.microsoft.com/office/word/2024/wordml/sdtformatlock" xmlns:w16se="http://schemas.microsoft.com/office/word/2015/wordml/symex" xmlns:wpg="http://schemas.microsoft.com/office/word/2010/wordprocessingGroup" xmlns:wpi="http://schemas.microsoft.com/office/word/2010/wordprocessingInk" xmlns:wne="http://schemas.microsoft.com/office/word/2006/wordml" xmlns:wps="http://schemas.microsoft.com/office/word/2010/wordprocessingShape" mc:Ignorable="w14 w15 w16se w16cid w16 w16cex w16sdtdh w16sdtfl w16du wp14">
   <w:p>
     <w:pPr>
       <w:pBdr>
@@ -50485,7 +53309,7 @@
 </file>
 
 <file path=word/footnotes.xml><?xml version="1.0" encoding="utf-8"?>
-<w:footnotes xmlns:wpc="http://schemas.microsoft.com/office/word/2010/wordprocessingCanvas" xmlns:cx="http://schemas.microsoft.com/office/drawing/2014/chartex" xmlns:cx1="http://schemas.microsoft.com/office/drawing/2015/9/8/chartex" xmlns:cx2="http://schemas.microsoft.com/office/drawing/2015/10/21/chartex" xmlns:cx3="http://schemas.microsoft.com/office/drawing/2016/5/9/chartex" xmlns:cx4="http://schemas.microsoft.com/office/drawing/2016/5/10/chartex" xmlns:cx5="http://schemas.microsoft.com/office/drawing/2016/5/11/chartex" xmlns:cx6="http://schemas.microsoft.com/office/drawing/2016/5/12/chartex" xmlns:cx7="http://schemas.microsoft.com/office/drawing/2016/5/13/chartex" xmlns:cx8="http://schemas.microsoft.com/office/drawing/2016/5/14/chartex" xmlns:mc="http://schemas.openxmlformats.org/markup-compatibility/2006" xmlns:aink="http://schemas.microsoft.com/office/drawing/2016/ink" xmlns:am3d="http://schemas.microsoft.com/office/drawing/2017/model3d" xmlns:o="urn:schemas-microsoft-com:office:office" xmlns:oel="http://schemas.microsoft.com/office/2019/extlst" xmlns:r="http://schemas.openxmlformats.org/officeDocument/2006/relationships" xmlns:m="http://schemas.openxmlformats.org/officeDocument/2006/math" xmlns:v="urn:schemas-microsoft-com:vml" xmlns:wp14="http://schemas.microsoft.com/office/word/2010/wordprocessingDrawing" xmlns:wp="http://schemas.openxmlformats.org/drawingml/2006/wordprocessingDrawing" xmlns:w10="urn:schemas-microsoft-com:office:word" xmlns:w="http://schemas.openxmlformats.org/wordprocessingml/2006/main" xmlns:w14="http://schemas.microsoft.com/office/word/2010/wordml" xmlns:w15="http://schemas.microsoft.com/office/word/2012/wordml" xmlns:w16cex="http://schemas.microsoft.com/office/word/2018/wordml/cex" xmlns:w16cid="http://schemas.microsoft.com/office/word/2016/wordml/cid" xmlns:w16="http://schemas.microsoft.com/office/word/2018/wordml" xmlns:w16sdtdh="http://schemas.microsoft.com/office/word/2020/wordml/sdtdatahash" xmlns:w16se="http://schemas.microsoft.com/office/word/2015/wordml/symex" xmlns:wpg="http://schemas.microsoft.com/office/word/2010/wordprocessingGroup" xmlns:wpi="http://schemas.microsoft.com/office/word/2010/wordprocessingInk" xmlns:wne="http://schemas.microsoft.com/office/word/2006/wordml" xmlns:wps="http://schemas.microsoft.com/office/word/2010/wordprocessingShape" mc:Ignorable="w14 w15 w16se w16cid w16 w16cex w16sdtdh wp14">
+<w:footnotes xmlns:wpc="http://schemas.microsoft.com/office/word/2010/wordprocessingCanvas" xmlns:cx="http://schemas.microsoft.com/office/drawing/2014/chartex" xmlns:cx1="http://schemas.microsoft.com/office/drawing/2015/9/8/chartex" xmlns:cx2="http://schemas.microsoft.com/office/drawing/2015/10/21/chartex" xmlns:cx3="http://schemas.microsoft.com/office/drawing/2016/5/9/chartex" xmlns:cx4="http://schemas.microsoft.com/office/drawing/2016/5/10/chartex" xmlns:cx5="http://schemas.microsoft.com/office/drawing/2016/5/11/chartex" xmlns:cx6="http://schemas.microsoft.com/office/drawing/2016/5/12/chartex" xmlns:cx7="http://schemas.microsoft.com/office/drawing/2016/5/13/chartex" xmlns:cx8="http://schemas.microsoft.com/office/drawing/2016/5/14/chartex" xmlns:mc="http://schemas.openxmlformats.org/markup-compatibility/2006" xmlns:aink="http://schemas.microsoft.com/office/drawing/2016/ink" xmlns:am3d="http://schemas.microsoft.com/office/drawing/2017/model3d" xmlns:o="urn:schemas-microsoft-com:office:office" xmlns:oel="http://schemas.microsoft.com/office/2019/extlst" xmlns:r="http://schemas.openxmlformats.org/officeDocument/2006/relationships" xmlns:m="http://schemas.openxmlformats.org/officeDocument/2006/math" xmlns:v="urn:schemas-microsoft-com:vml" xmlns:wp14="http://schemas.microsoft.com/office/word/2010/wordprocessingDrawing" xmlns:wp="http://schemas.openxmlformats.org/drawingml/2006/wordprocessingDrawing" xmlns:w10="urn:schemas-microsoft-com:office:word" xmlns:w="http://schemas.openxmlformats.org/wordprocessingml/2006/main" xmlns:w14="http://schemas.microsoft.com/office/word/2010/wordml" xmlns:w15="http://schemas.microsoft.com/office/word/2012/wordml" xmlns:w16cex="http://schemas.microsoft.com/office/word/2018/wordml/cex" xmlns:w16cid="http://schemas.microsoft.com/office/word/2016/wordml/cid" xmlns:w16="http://schemas.microsoft.com/office/word/2018/wordml" xmlns:w16du="http://schemas.microsoft.com/office/word/2023/wordml/word16du" xmlns:w16sdtdh="http://schemas.microsoft.com/office/word/2020/wordml/sdtdatahash" xmlns:w16sdtfl="http://schemas.microsoft.com/office/word/2024/wordml/sdtformatlock" xmlns:w16se="http://schemas.microsoft.com/office/word/2015/wordml/symex" xmlns:wpg="http://schemas.microsoft.com/office/word/2010/wordprocessingGroup" xmlns:wpi="http://schemas.microsoft.com/office/word/2010/wordprocessingInk" xmlns:wne="http://schemas.microsoft.com/office/word/2006/wordml" xmlns:wps="http://schemas.microsoft.com/office/word/2010/wordprocessingShape" mc:Ignorable="w14 w15 w16se w16cid w16 w16cex w16sdtdh w16sdtfl w16du wp14">
   <w:footnote w:type="separator" w:id="-1">
     <w:p>
       <w:pPr>
@@ -50510,7 +53334,7 @@
 </file>
 
 <file path=word/header1.xml><?xml version="1.0" encoding="utf-8"?>
-<w:hdr xmlns:wpc="http://schemas.microsoft.com/office/word/2010/wordprocessingCanvas" xmlns:cx="http://schemas.microsoft.com/office/drawing/2014/chartex" xmlns:cx1="http://schemas.microsoft.com/office/drawing/2015/9/8/chartex" xmlns:cx2="http://schemas.microsoft.com/office/drawing/2015/10/21/chartex" xmlns:cx3="http://schemas.microsoft.com/office/drawing/2016/5/9/chartex" xmlns:cx4="http://schemas.microsoft.com/office/drawing/2016/5/10/chartex" xmlns:cx5="http://schemas.microsoft.com/office/drawing/2016/5/11/chartex" xmlns:cx6="http://schemas.microsoft.com/office/drawing/2016/5/12/chartex" xmlns:cx7="http://schemas.microsoft.com/office/drawing/2016/5/13/chartex" xmlns:cx8="http://schemas.microsoft.com/office/drawing/2016/5/14/chartex" xmlns:mc="http://schemas.openxmlformats.org/markup-compatibility/2006" xmlns:aink="http://schemas.microsoft.com/office/drawing/2016/ink" xmlns:am3d="http://schemas.microsoft.com/office/drawing/2017/model3d" xmlns:o="urn:schemas-microsoft-com:office:office" xmlns:oel="http://schemas.microsoft.com/office/2019/extlst" xmlns:r="http://schemas.openxmlformats.org/officeDocument/2006/relationships" xmlns:m="http://schemas.openxmlformats.org/officeDocument/2006/math" xmlns:v="urn:schemas-microsoft-com:vml" xmlns:wp14="http://schemas.microsoft.com/office/word/2010/wordprocessingDrawing" xmlns:wp="http://schemas.openxmlformats.org/drawingml/2006/wordprocessingDrawing" xmlns:w10="urn:schemas-microsoft-com:office:word" xmlns:w="http://schemas.openxmlformats.org/wordprocessingml/2006/main" xmlns:w14="http://schemas.microsoft.com/office/word/2010/wordml" xmlns:w15="http://schemas.microsoft.com/office/word/2012/wordml" xmlns:w16cex="http://schemas.microsoft.com/office/word/2018/wordml/cex" xmlns:w16cid="http://schemas.microsoft.com/office/word/2016/wordml/cid" xmlns:w16="http://schemas.microsoft.com/office/word/2018/wordml" xmlns:w16sdtdh="http://schemas.microsoft.com/office/word/2020/wordml/sdtdatahash" xmlns:w16se="http://schemas.microsoft.com/office/word/2015/wordml/symex" xmlns:wpg="http://schemas.microsoft.com/office/word/2010/wordprocessingGroup" xmlns:wpi="http://schemas.microsoft.com/office/word/2010/wordprocessingInk" xmlns:wne="http://schemas.microsoft.com/office/word/2006/wordml" xmlns:wps="http://schemas.microsoft.com/office/word/2010/wordprocessingShape" mc:Ignorable="w14 w15 w16se w16cid w16 w16cex w16sdtdh wp14">
+<w:hdr xmlns:wpc="http://schemas.microsoft.com/office/word/2010/wordprocessingCanvas" xmlns:cx="http://schemas.microsoft.com/office/drawing/2014/chartex" xmlns:cx1="http://schemas.microsoft.com/office/drawing/2015/9/8/chartex" xmlns:cx2="http://schemas.microsoft.com/office/drawing/2015/10/21/chartex" xmlns:cx3="http://schemas.microsoft.com/office/drawing/2016/5/9/chartex" xmlns:cx4="http://schemas.microsoft.com/office/drawing/2016/5/10/chartex" xmlns:cx5="http://schemas.microsoft.com/office/drawing/2016/5/11/chartex" xmlns:cx6="http://schemas.microsoft.com/office/drawing/2016/5/12/chartex" xmlns:cx7="http://schemas.microsoft.com/office/drawing/2016/5/13/chartex" xmlns:cx8="http://schemas.microsoft.com/office/drawing/2016/5/14/chartex" xmlns:mc="http://schemas.openxmlformats.org/markup-compatibility/2006" xmlns:aink="http://schemas.microsoft.com/office/drawing/2016/ink" xmlns:am3d="http://schemas.microsoft.com/office/drawing/2017/model3d" xmlns:o="urn:schemas-microsoft-com:office:office" xmlns:oel="http://schemas.microsoft.com/office/2019/extlst" xmlns:r="http://schemas.openxmlformats.org/officeDocument/2006/relationships" xmlns:m="http://schemas.openxmlformats.org/officeDocument/2006/math" xmlns:v="urn:schemas-microsoft-com:vml" xmlns:wp14="http://schemas.microsoft.com/office/word/2010/wordprocessingDrawing" xmlns:wp="http://schemas.openxmlformats.org/drawingml/2006/wordprocessingDrawing" xmlns:w10="urn:schemas-microsoft-com:office:word" xmlns:w="http://schemas.openxmlformats.org/wordprocessingml/2006/main" xmlns:w14="http://schemas.microsoft.com/office/word/2010/wordml" xmlns:w15="http://schemas.microsoft.com/office/word/2012/wordml" xmlns:w16cex="http://schemas.microsoft.com/office/word/2018/wordml/cex" xmlns:w16cid="http://schemas.microsoft.com/office/word/2016/wordml/cid" xmlns:w16="http://schemas.microsoft.com/office/word/2018/wordml" xmlns:w16du="http://schemas.microsoft.com/office/word/2023/wordml/word16du" xmlns:w16sdtdh="http://schemas.microsoft.com/office/word/2020/wordml/sdtdatahash" xmlns:w16sdtfl="http://schemas.microsoft.com/office/word/2024/wordml/sdtformatlock" xmlns:w16se="http://schemas.microsoft.com/office/word/2015/wordml/symex" xmlns:wpg="http://schemas.microsoft.com/office/word/2010/wordprocessingGroup" xmlns:wpi="http://schemas.microsoft.com/office/word/2010/wordprocessingInk" xmlns:wne="http://schemas.microsoft.com/office/word/2006/wordml" xmlns:wps="http://schemas.microsoft.com/office/word/2010/wordprocessingShape" mc:Ignorable="w14 w15 w16se w16cid w16 w16cex w16sdtdh w16sdtfl w16du wp14">
   <w:p>
     <w:pPr>
       <w:pStyle w:val="Header"/>
@@ -50531,7 +53355,7 @@
 </file>
 
 <file path=word/header2.xml><?xml version="1.0" encoding="utf-8"?>
-<w:hdr xmlns:wpc="http://schemas.microsoft.com/office/word/2010/wordprocessingCanvas" xmlns:cx="http://schemas.microsoft.com/office/drawing/2014/chartex" xmlns:cx1="http://schemas.microsoft.com/office/drawing/2015/9/8/chartex" xmlns:cx2="http://schemas.microsoft.com/office/drawing/2015/10/21/chartex" xmlns:cx3="http://schemas.microsoft.com/office/drawing/2016/5/9/chartex" xmlns:cx4="http://schemas.microsoft.com/office/drawing/2016/5/10/chartex" xmlns:cx5="http://schemas.microsoft.com/office/drawing/2016/5/11/chartex" xmlns:cx6="http://schemas.microsoft.com/office/drawing/2016/5/12/chartex" xmlns:cx7="http://schemas.microsoft.com/office/drawing/2016/5/13/chartex" xmlns:cx8="http://schemas.microsoft.com/office/drawing/2016/5/14/chartex" xmlns:mc="http://schemas.openxmlformats.org/markup-compatibility/2006" xmlns:aink="http://schemas.microsoft.com/office/drawing/2016/ink" xmlns:am3d="http://schemas.microsoft.com/office/drawing/2017/model3d" xmlns:o="urn:schemas-microsoft-com:office:office" xmlns:oel="http://schemas.microsoft.com/office/2019/extlst" xmlns:r="http://schemas.openxmlformats.org/officeDocument/2006/relationships" xmlns:m="http://schemas.openxmlformats.org/officeDocument/2006/math" xmlns:v="urn:schemas-microsoft-com:vml" xmlns:wp14="http://schemas.microsoft.com/office/word/2010/wordprocessingDrawing" xmlns:wp="http://schemas.openxmlformats.org/drawingml/2006/wordprocessingDrawing" xmlns:w10="urn:schemas-microsoft-com:office:word" xmlns:w="http://schemas.openxmlformats.org/wordprocessingml/2006/main" xmlns:w14="http://schemas.microsoft.com/office/word/2010/wordml" xmlns:w15="http://schemas.microsoft.com/office/word/2012/wordml" xmlns:w16cex="http://schemas.microsoft.com/office/word/2018/wordml/cex" xmlns:w16cid="http://schemas.microsoft.com/office/word/2016/wordml/cid" xmlns:w16="http://schemas.microsoft.com/office/word/2018/wordml" xmlns:w16sdtdh="http://schemas.microsoft.com/office/word/2020/wordml/sdtdatahash" xmlns:w16se="http://schemas.microsoft.com/office/word/2015/wordml/symex" xmlns:wpg="http://schemas.microsoft.com/office/word/2010/wordprocessingGroup" xmlns:wpi="http://schemas.microsoft.com/office/word/2010/wordprocessingInk" xmlns:wne="http://schemas.microsoft.com/office/word/2006/wordml" xmlns:wps="http://schemas.microsoft.com/office/word/2010/wordprocessingShape" mc:Ignorable="w14 w15 w16se w16cid w16 w16cex w16sdtdh wp14">
+<w:hdr xmlns:wpc="http://schemas.microsoft.com/office/word/2010/wordprocessingCanvas" xmlns:cx="http://schemas.microsoft.com/office/drawing/2014/chartex" xmlns:cx1="http://schemas.microsoft.com/office/drawing/2015/9/8/chartex" xmlns:cx2="http://schemas.microsoft.com/office/drawing/2015/10/21/chartex" xmlns:cx3="http://schemas.microsoft.com/office/drawing/2016/5/9/chartex" xmlns:cx4="http://schemas.microsoft.com/office/drawing/2016/5/10/chartex" xmlns:cx5="http://schemas.microsoft.com/office/drawing/2016/5/11/chartex" xmlns:cx6="http://schemas.microsoft.com/office/drawing/2016/5/12/chartex" xmlns:cx7="http://schemas.microsoft.com/office/drawing/2016/5/13/chartex" xmlns:cx8="http://schemas.microsoft.com/office/drawing/2016/5/14/chartex" xmlns:mc="http://schemas.openxmlformats.org/markup-compatibility/2006" xmlns:aink="http://schemas.microsoft.com/office/drawing/2016/ink" xmlns:am3d="http://schemas.microsoft.com/office/drawing/2017/model3d" xmlns:o="urn:schemas-microsoft-com:office:office" xmlns:oel="http://schemas.microsoft.com/office/2019/extlst" xmlns:r="http://schemas.openxmlformats.org/officeDocument/2006/relationships" xmlns:m="http://schemas.openxmlformats.org/officeDocument/2006/math" xmlns:v="urn:schemas-microsoft-com:vml" xmlns:wp14="http://schemas.microsoft.com/office/word/2010/wordprocessingDrawing" xmlns:wp="http://schemas.openxmlformats.org/drawingml/2006/wordprocessingDrawing" xmlns:w10="urn:schemas-microsoft-com:office:word" xmlns:w="http://schemas.openxmlformats.org/wordprocessingml/2006/main" xmlns:w14="http://schemas.microsoft.com/office/word/2010/wordml" xmlns:w15="http://schemas.microsoft.com/office/word/2012/wordml" xmlns:w16cex="http://schemas.microsoft.com/office/word/2018/wordml/cex" xmlns:w16cid="http://schemas.microsoft.com/office/word/2016/wordml/cid" xmlns:w16="http://schemas.microsoft.com/office/word/2018/wordml" xmlns:w16du="http://schemas.microsoft.com/office/word/2023/wordml/word16du" xmlns:w16sdtdh="http://schemas.microsoft.com/office/word/2020/wordml/sdtdatahash" xmlns:w16sdtfl="http://schemas.microsoft.com/office/word/2024/wordml/sdtformatlock" xmlns:w16se="http://schemas.microsoft.com/office/word/2015/wordml/symex" xmlns:wpg="http://schemas.microsoft.com/office/word/2010/wordprocessingGroup" xmlns:wpi="http://schemas.microsoft.com/office/word/2010/wordprocessingInk" xmlns:wne="http://schemas.microsoft.com/office/word/2006/wordml" xmlns:wps="http://schemas.microsoft.com/office/word/2010/wordprocessingShape" mc:Ignorable="w14 w15 w16se w16cid w16 w16cex w16sdtdh w16sdtfl w16du wp14">
   <w:p>
     <w:pPr>
       <w:pStyle w:val="Header"/>
@@ -50544,7 +53368,7 @@
 </file>
 
 <file path=word/styles.xml><?xml version="1.0" encoding="utf-8"?>
-<w:styles xmlns:mc="http://schemas.openxmlformats.org/markup-compatibility/2006" xmlns:r="http://schemas.openxmlformats.org/officeDocument/2006/relationships" xmlns:w="http://schemas.openxmlformats.org/wordprocessingml/2006/main" xmlns:w14="http://schemas.microsoft.com/office/word/2010/wordml" xmlns:w15="http://schemas.microsoft.com/office/word/2012/wordml" xmlns:w16cex="http://schemas.microsoft.com/office/word/2018/wordml/cex" xmlns:w16cid="http://schemas.microsoft.com/office/word/2016/wordml/cid" xmlns:w16="http://schemas.microsoft.com/office/word/2018/wordml" xmlns:w16sdtdh="http://schemas.microsoft.com/office/word/2020/wordml/sdtdatahash" xmlns:w16se="http://schemas.microsoft.com/office/word/2015/wordml/symex" mc:Ignorable="w14 w15 w16se w16cid w16 w16cex w16sdtdh">
+<w:styles xmlns:mc="http://schemas.openxmlformats.org/markup-compatibility/2006" xmlns:r="http://schemas.openxmlformats.org/officeDocument/2006/relationships" xmlns:w="http://schemas.openxmlformats.org/wordprocessingml/2006/main" xmlns:w14="http://schemas.microsoft.com/office/word/2010/wordml" xmlns:w15="http://schemas.microsoft.com/office/word/2012/wordml" xmlns:w16cex="http://schemas.microsoft.com/office/word/2018/wordml/cex" xmlns:w16cid="http://schemas.microsoft.com/office/word/2016/wordml/cid" xmlns:w16="http://schemas.microsoft.com/office/word/2018/wordml" xmlns:w16du="http://schemas.microsoft.com/office/word/2023/wordml/word16du" xmlns:w16sdtdh="http://schemas.microsoft.com/office/word/2020/wordml/sdtdatahash" xmlns:w16sdtfl="http://schemas.microsoft.com/office/word/2024/wordml/sdtformatlock" xmlns:w16se="http://schemas.microsoft.com/office/word/2015/wordml/symex" mc:Ignorable="w14 w15 w16se w16cid w16 w16cex w16sdtdh w16sdtfl w16du">
   <w:docDefaults>
     <w:rPrDefault>
       <w:rPr>

</xml_diff>